<commit_message>
E3 con las rayas largas ajustadas
Revision del autor sobre el entregable: se quitaron 40 rayas largas (de 76 a 36), 28 en el texto y 12 en tablas, dejando las que separan titulos y epigrafes. Verificado: estructura, tablas, titulos, figuras y formato institucional intactos, la correccion de la Tabla 3 en su lugar, y 67 paginas.
</commit_message>
<xml_diff>
--- a/docs/Santos_Perfil_Proyecto_E3.docx
+++ b/docs/Santos_Perfil_Proyecto_E3.docx
@@ -3122,7 +3122,31 @@
         <w:jc w:val="both"/>
       </w:pPr>
       <w:r>
-        <w:t>En el ámbito institucional, los antecedentes comparan el rendimiento de distintos sistemas hidropónicos (Tejerina Pinto, 2018; Santos Navarro, 2020), mientras que la necesidad de mantener las variables de la solución dentro de rangos de referencia está establecida por la literatura del cultivo sin suelo (Jensen, 1997; Resh, 2013; Urrestarazu, 2004). En el ensayo previo de espinaca las variables de la solución se midieron con un pHmetro y un conductímetro portátiles y se usaron para corregir la solución en el momento, pero no se conservó la serie de las lecturas (Santos Navarro, 2020; comunicación personal, 2026), de modo que el análisis se limitó a las variables de respuesta del cultivo; Cruz Cerruto (2019) y Baldiviezo Mercado (2019) demostraron la viabilidad técnica de integrar sensores y aplicaciones informáticas en entornos de cultivo, con énfasis en el control antes que en la organización de la información. De ese contraste se delimita el vacío que aborda este trabajo: no existe una solución que integre la adquisición, el registro, la visualización y el seguimiento de las variables de un cultivo hidropónico mediante rangos de referencia por cultivo, disponible para distintos perfiles de usuario y sobre tecnologías accesibles.</w:t>
+        <w:t xml:space="preserve">En el ámbito institucional, los antecedentes comparan el rendimiento de distintos sistemas hidropónicos (Tejerina Pinto, 2018; Santos Navarro, 2020), mientras que la necesidad de mantener las variables de la solución dentro de rangos de referencia está establecida por la literatura del cultivo sin suelo (Jensen, 1997; </w:t>
+      </w:r>
+      <w:proofErr w:type="spellStart"/>
+      <w:r>
+        <w:t>Resh</w:t>
+      </w:r>
+      <w:proofErr w:type="spellEnd"/>
+      <w:r>
+        <w:t xml:space="preserve">, 2013; Urrestarazu, 2004). En el ensayo previo de espinaca las variables de la solución se midieron con un </w:t>
+      </w:r>
+      <w:proofErr w:type="spellStart"/>
+      <w:r>
+        <w:t>pHmetro</w:t>
+      </w:r>
+      <w:proofErr w:type="spellEnd"/>
+      <w:r>
+        <w:t xml:space="preserve"> y un conductímetro portátiles y se usaron para corregir la solución en el momento, pero no se conservó la serie de las lecturas (Santos Navarro, 2020; comunicación personal, 2026), de modo que el análisis se limitó a las variables de respuesta del cultivo; Cruz Cerruto (2019) y </w:t>
+      </w:r>
+      <w:proofErr w:type="spellStart"/>
+      <w:r>
+        <w:t>Baldiviezo</w:t>
+      </w:r>
+      <w:proofErr w:type="spellEnd"/>
+      <w:r>
+        <w:t xml:space="preserve"> Mercado (2019) demostraron la viabilidad técnica de integrar sensores y aplicaciones informáticas en entornos de cultivo, con énfasis en el control antes que en la organización de la información. De ese contraste se delimita el vacío que aborda este trabajo: no existe una solución que integre la adquisición, el registro, la visualización y el seguimiento de las variables de un cultivo hidropónico mediante rangos de referencia por cultivo, disponible para distintos perfiles de usuario y sobre tecnologías accesibles.</w:t>
       </w:r>
     </w:p>
     <w:p>
@@ -3131,7 +3155,15 @@
       </w:pPr>
       <w:r>
         <w:lastRenderedPageBreak/>
-        <w:t>En paralelo, el uso de sensores de bajo costo, microcontroladores y plataformas de almacenamiento en la nube permite capturar, transmitir y analizar esa información de forma continua, en el marco del Internet de las Cosas (IoT) aplicado a la agricultura (Tzounis et al., 2017), lo que abre la puerta a su registro sistemático, a la consulta histórica y a la generación de alertas oportunas. La barrera dejó de estar en la medición y pasó a estar en la gestión de los datos obtenidos.</w:t>
+        <w:t>En paralelo, el uso de sensores de bajo costo, microcontroladores y plataformas de almacenamiento en la nube permite capturar, transmitir y analizar esa información de forma continua, en el marco del Internet de las Cosas (IoT) aplicado a la agricultura (</w:t>
+      </w:r>
+      <w:proofErr w:type="spellStart"/>
+      <w:r>
+        <w:t>Tzounis</w:t>
+      </w:r>
+      <w:proofErr w:type="spellEnd"/>
+      <w:r>
+        <w:t xml:space="preserve"> et al., 2017), lo que abre la puerta a su registro sistemático, a la consulta histórica y a la generación de alertas oportunas. La barrera dejó de estar en la medición y pasó a estar en la gestión de los datos obtenidos.</w:t>
       </w:r>
     </w:p>
     <w:tbl>
@@ -3310,8 +3342,13 @@
             <w:pPr>
               <w:spacing w:after="0"/>
             </w:pPr>
-            <w:r>
-              <w:t>Bluelab (instrumentos de medición)</w:t>
+            <w:proofErr w:type="spellStart"/>
+            <w:r>
+              <w:t>Bluelab</w:t>
+            </w:r>
+            <w:proofErr w:type="spellEnd"/>
+            <w:r>
+              <w:t xml:space="preserve"> (instrumentos de medición)</w:t>
             </w:r>
           </w:p>
         </w:tc>
@@ -3395,324 +3432,336 @@
                 <w:lang w:val="en-US"/>
               </w:rPr>
             </w:pPr>
+            <w:proofErr w:type="spellStart"/>
             <w:r>
               <w:rPr>
                 <w:sz w:val="22"/>
                 <w:szCs w:val="22"/>
                 <w:lang w:val="en-US"/>
               </w:rPr>
-              <w:t xml:space="preserve">Bluelab (s. f.). </w:t>
-            </w:r>
-          </w:p>
-          <w:p>
-            <w:pPr>
-              <w:spacing w:after="0"/>
+              <w:t>Bluelab</w:t>
+            </w:r>
+            <w:proofErr w:type="spellEnd"/>
+            <w:r>
               <w:rPr>
                 <w:sz w:val="22"/>
                 <w:szCs w:val="22"/>
                 <w:lang w:val="en-US"/>
               </w:rPr>
-            </w:pPr>
-            <w:r>
+              <w:t xml:space="preserve"> (s. f.). </w:t>
+            </w:r>
+          </w:p>
+          <w:p>
+            <w:pPr>
+              <w:spacing w:after="0"/>
               <w:rPr>
                 <w:sz w:val="22"/>
                 <w:szCs w:val="22"/>
                 <w:lang w:val="en-US"/>
               </w:rPr>
-              <w:t>https://bluelab.com</w:t>
-            </w:r>
-          </w:p>
-          <w:p>
-            <w:pPr>
-              <w:spacing w:after="0"/>
-              <w:rPr>
-                <w:sz w:val="22"/>
-                <w:szCs w:val="22"/>
-              </w:rPr>
-            </w:pPr>
-            <w:r>
-              <w:rPr>
-                <w:sz w:val="22"/>
-                <w:szCs w:val="22"/>
-              </w:rPr>
-              <w:t>consulta: 13/09/2026</w:t>
-            </w:r>
-          </w:p>
-        </w:tc>
-      </w:tr>
-      <w:tr>
-        <w:tc>
-          <w:tcPr>
-            <w:tcW w:w="1735" w:type="dxa"/>
-            <w:tcMar>
-              <w:top w:w="60" w:type="dxa"/>
-              <w:left w:w="100" w:type="dxa"/>
-              <w:bottom w:w="60" w:type="dxa"/>
-              <w:right w:w="100" w:type="dxa"/>
-            </w:tcMar>
-            <w:vAlign w:val="center"/>
-          </w:tcPr>
-          <w:p>
-            <w:pPr>
-              <w:spacing w:after="0"/>
-            </w:pPr>
-            <w:r>
-              <w:t>Hanna Instruments (instrumentos y controladores)</w:t>
-            </w:r>
-          </w:p>
-        </w:tc>
-        <w:tc>
-          <w:tcPr>
-            <w:tcW w:w="1668" w:type="dxa"/>
-            <w:tcMar>
-              <w:top w:w="60" w:type="dxa"/>
-              <w:left w:w="100" w:type="dxa"/>
-              <w:bottom w:w="60" w:type="dxa"/>
-              <w:right w:w="100" w:type="dxa"/>
-            </w:tcMar>
-            <w:vAlign w:val="center"/>
-          </w:tcPr>
-          <w:p>
-            <w:pPr>
-              <w:spacing w:after="0"/>
-            </w:pPr>
-            <w:r>
-              <w:t>Medidores, fotómetros y tituladores; controladores de fertirrigación</w:t>
-            </w:r>
-          </w:p>
-        </w:tc>
-        <w:tc>
-          <w:tcPr>
-            <w:tcW w:w="1455" w:type="dxa"/>
-            <w:tcMar>
-              <w:top w:w="60" w:type="dxa"/>
-              <w:left w:w="100" w:type="dxa"/>
-              <w:bottom w:w="60" w:type="dxa"/>
-              <w:right w:w="100" w:type="dxa"/>
-            </w:tcMar>
-            <w:vAlign w:val="center"/>
-          </w:tcPr>
-          <w:p>
-            <w:pPr>
-              <w:spacing w:after="0"/>
-            </w:pPr>
-            <w:r>
-              <w:t>Medición de laboratorio y dosificación automática de la solución</w:t>
-            </w:r>
-          </w:p>
-        </w:tc>
-        <w:tc>
-          <w:tcPr>
-            <w:tcW w:w="1628" w:type="dxa"/>
-            <w:tcMar>
-              <w:top w:w="60" w:type="dxa"/>
-              <w:left w:w="100" w:type="dxa"/>
-              <w:bottom w:w="60" w:type="dxa"/>
-              <w:right w:w="100" w:type="dxa"/>
-            </w:tcMar>
-            <w:vAlign w:val="center"/>
-          </w:tcPr>
-          <w:p>
-            <w:pPr>
-              <w:spacing w:after="0"/>
-            </w:pPr>
-            <w:r>
-              <w:t>El historial no se organiza por cultivo ni se contrasta contra rangos de referencia consultables</w:t>
-            </w:r>
-          </w:p>
-        </w:tc>
-        <w:tc>
-          <w:tcPr>
-            <w:tcW w:w="2865" w:type="dxa"/>
-            <w:tcMar>
-              <w:top w:w="60" w:type="dxa"/>
-              <w:left w:w="100" w:type="dxa"/>
-              <w:bottom w:w="60" w:type="dxa"/>
-              <w:right w:w="100" w:type="dxa"/>
-            </w:tcMar>
-            <w:vAlign w:val="center"/>
-          </w:tcPr>
-          <w:p>
-            <w:pPr>
-              <w:spacing w:after="0"/>
+            </w:pPr>
+            <w:r>
               <w:rPr>
                 <w:sz w:val="22"/>
                 <w:szCs w:val="22"/>
                 <w:lang w:val="en-US"/>
               </w:rPr>
-            </w:pPr>
-            <w:r>
+              <w:t>https://bluelab.com</w:t>
+            </w:r>
+          </w:p>
+          <w:p>
+            <w:pPr>
+              <w:spacing w:after="0"/>
+              <w:rPr>
+                <w:sz w:val="22"/>
+                <w:szCs w:val="22"/>
+              </w:rPr>
+            </w:pPr>
+            <w:r>
+              <w:rPr>
+                <w:sz w:val="22"/>
+                <w:szCs w:val="22"/>
+              </w:rPr>
+              <w:t>consulta: 13/09/2026</w:t>
+            </w:r>
+          </w:p>
+        </w:tc>
+      </w:tr>
+      <w:tr>
+        <w:tc>
+          <w:tcPr>
+            <w:tcW w:w="1735" w:type="dxa"/>
+            <w:tcMar>
+              <w:top w:w="60" w:type="dxa"/>
+              <w:left w:w="100" w:type="dxa"/>
+              <w:bottom w:w="60" w:type="dxa"/>
+              <w:right w:w="100" w:type="dxa"/>
+            </w:tcMar>
+            <w:vAlign w:val="center"/>
+          </w:tcPr>
+          <w:p>
+            <w:pPr>
+              <w:spacing w:after="0"/>
+            </w:pPr>
+            <w:r>
+              <w:t>Hanna Instruments (instrumentos y controladores)</w:t>
+            </w:r>
+          </w:p>
+        </w:tc>
+        <w:tc>
+          <w:tcPr>
+            <w:tcW w:w="1668" w:type="dxa"/>
+            <w:tcMar>
+              <w:top w:w="60" w:type="dxa"/>
+              <w:left w:w="100" w:type="dxa"/>
+              <w:bottom w:w="60" w:type="dxa"/>
+              <w:right w:w="100" w:type="dxa"/>
+            </w:tcMar>
+            <w:vAlign w:val="center"/>
+          </w:tcPr>
+          <w:p>
+            <w:pPr>
+              <w:spacing w:after="0"/>
+            </w:pPr>
+            <w:r>
+              <w:t xml:space="preserve">Medidores, fotómetros y tituladores; controladores de </w:t>
+            </w:r>
+            <w:proofErr w:type="spellStart"/>
+            <w:r>
+              <w:t>fertirrigación</w:t>
+            </w:r>
+            <w:proofErr w:type="spellEnd"/>
+          </w:p>
+        </w:tc>
+        <w:tc>
+          <w:tcPr>
+            <w:tcW w:w="1455" w:type="dxa"/>
+            <w:tcMar>
+              <w:top w:w="60" w:type="dxa"/>
+              <w:left w:w="100" w:type="dxa"/>
+              <w:bottom w:w="60" w:type="dxa"/>
+              <w:right w:w="100" w:type="dxa"/>
+            </w:tcMar>
+            <w:vAlign w:val="center"/>
+          </w:tcPr>
+          <w:p>
+            <w:pPr>
+              <w:spacing w:after="0"/>
+            </w:pPr>
+            <w:r>
+              <w:t>Medición de laboratorio y dosificación automática de la solución</w:t>
+            </w:r>
+          </w:p>
+        </w:tc>
+        <w:tc>
+          <w:tcPr>
+            <w:tcW w:w="1628" w:type="dxa"/>
+            <w:tcMar>
+              <w:top w:w="60" w:type="dxa"/>
+              <w:left w:w="100" w:type="dxa"/>
+              <w:bottom w:w="60" w:type="dxa"/>
+              <w:right w:w="100" w:type="dxa"/>
+            </w:tcMar>
+            <w:vAlign w:val="center"/>
+          </w:tcPr>
+          <w:p>
+            <w:pPr>
+              <w:spacing w:after="0"/>
+            </w:pPr>
+            <w:r>
+              <w:t>El historial no se organiza por cultivo ni se contrasta contra rangos de referencia consultables</w:t>
+            </w:r>
+          </w:p>
+        </w:tc>
+        <w:tc>
+          <w:tcPr>
+            <w:tcW w:w="2865" w:type="dxa"/>
+            <w:tcMar>
+              <w:top w:w="60" w:type="dxa"/>
+              <w:left w:w="100" w:type="dxa"/>
+              <w:bottom w:w="60" w:type="dxa"/>
+              <w:right w:w="100" w:type="dxa"/>
+            </w:tcMar>
+            <w:vAlign w:val="center"/>
+          </w:tcPr>
+          <w:p>
+            <w:pPr>
+              <w:spacing w:after="0"/>
               <w:rPr>
                 <w:sz w:val="22"/>
                 <w:szCs w:val="22"/>
                 <w:lang w:val="en-US"/>
               </w:rPr>
-              <w:t>Hanna Instruments (s. f.)</w:t>
-            </w:r>
-          </w:p>
-          <w:p>
-            <w:pPr>
-              <w:spacing w:after="0"/>
+            </w:pPr>
+            <w:r>
               <w:rPr>
                 <w:sz w:val="22"/>
                 <w:szCs w:val="22"/>
                 <w:lang w:val="en-US"/>
               </w:rPr>
-            </w:pPr>
-            <w:r>
+              <w:t>Hanna Instruments (s. f.)</w:t>
+            </w:r>
+          </w:p>
+          <w:p>
+            <w:pPr>
+              <w:spacing w:after="0"/>
               <w:rPr>
                 <w:sz w:val="22"/>
                 <w:szCs w:val="22"/>
                 <w:lang w:val="en-US"/>
               </w:rPr>
-              <w:t>https://hannainst.com</w:t>
-            </w:r>
-          </w:p>
-          <w:p>
-            <w:pPr>
-              <w:spacing w:after="0"/>
-              <w:rPr>
-                <w:sz w:val="22"/>
-                <w:szCs w:val="22"/>
-              </w:rPr>
-            </w:pPr>
-            <w:r>
-              <w:rPr>
-                <w:sz w:val="22"/>
-                <w:szCs w:val="22"/>
-              </w:rPr>
-              <w:t>consulta: 13/09/2026</w:t>
-            </w:r>
-          </w:p>
-        </w:tc>
-      </w:tr>
-      <w:tr>
-        <w:tc>
-          <w:tcPr>
-            <w:tcW w:w="1735" w:type="dxa"/>
-            <w:tcMar>
-              <w:top w:w="60" w:type="dxa"/>
-              <w:left w:w="100" w:type="dxa"/>
-              <w:bottom w:w="60" w:type="dxa"/>
-              <w:right w:w="100" w:type="dxa"/>
-            </w:tcMar>
-            <w:vAlign w:val="center"/>
-          </w:tcPr>
-          <w:p>
-            <w:pPr>
-              <w:spacing w:after="0"/>
-            </w:pPr>
-            <w:r>
-              <w:lastRenderedPageBreak/>
-              <w:t>TrolMaster (control ambiental)</w:t>
-            </w:r>
-          </w:p>
-        </w:tc>
-        <w:tc>
-          <w:tcPr>
-            <w:tcW w:w="1668" w:type="dxa"/>
-            <w:tcMar>
-              <w:top w:w="60" w:type="dxa"/>
-              <w:left w:w="100" w:type="dxa"/>
-              <w:bottom w:w="60" w:type="dxa"/>
-              <w:right w:w="100" w:type="dxa"/>
-            </w:tcMar>
-            <w:vAlign w:val="center"/>
-          </w:tcPr>
-          <w:p>
-            <w:pPr>
-              <w:spacing w:after="0"/>
-            </w:pPr>
-            <w:r>
-              <w:t>Control de clima, riego, dióxido de carbono y ventilación con aplicación asociada</w:t>
-            </w:r>
-          </w:p>
-        </w:tc>
-        <w:tc>
-          <w:tcPr>
-            <w:tcW w:w="1455" w:type="dxa"/>
-            <w:tcMar>
-              <w:top w:w="60" w:type="dxa"/>
-              <w:left w:w="100" w:type="dxa"/>
-              <w:bottom w:w="60" w:type="dxa"/>
-              <w:right w:w="100" w:type="dxa"/>
-            </w:tcMar>
-            <w:vAlign w:val="center"/>
-          </w:tcPr>
-          <w:p>
-            <w:pPr>
-              <w:spacing w:after="0"/>
-            </w:pPr>
-            <w:r>
-              <w:t>Control automático del entorno productivo</w:t>
-            </w:r>
-          </w:p>
-        </w:tc>
-        <w:tc>
-          <w:tcPr>
-            <w:tcW w:w="1628" w:type="dxa"/>
-            <w:tcMar>
-              <w:top w:w="60" w:type="dxa"/>
-              <w:left w:w="100" w:type="dxa"/>
-              <w:bottom w:w="60" w:type="dxa"/>
-              <w:right w:w="100" w:type="dxa"/>
-            </w:tcMar>
-            <w:vAlign w:val="center"/>
-          </w:tcPr>
-          <w:p>
-            <w:pPr>
-              <w:spacing w:after="0"/>
-            </w:pPr>
-            <w:r>
-              <w:t>Ecosistema propietario y costo elevado; prioriza el control sobre la gestión de los datos</w:t>
-            </w:r>
-          </w:p>
-        </w:tc>
-        <w:tc>
-          <w:tcPr>
-            <w:tcW w:w="2865" w:type="dxa"/>
-            <w:tcMar>
-              <w:top w:w="60" w:type="dxa"/>
-              <w:left w:w="100" w:type="dxa"/>
-              <w:bottom w:w="60" w:type="dxa"/>
-              <w:right w:w="100" w:type="dxa"/>
-            </w:tcMar>
-            <w:vAlign w:val="center"/>
-          </w:tcPr>
-          <w:p>
-            <w:pPr>
-              <w:spacing w:after="0"/>
+            </w:pPr>
+            <w:r>
               <w:rPr>
                 <w:sz w:val="22"/>
                 <w:szCs w:val="22"/>
                 <w:lang w:val="en-US"/>
               </w:rPr>
-            </w:pPr>
-            <w:r>
+              <w:t>https://hannainst.com</w:t>
+            </w:r>
+          </w:p>
+          <w:p>
+            <w:pPr>
+              <w:spacing w:after="0"/>
+              <w:rPr>
+                <w:sz w:val="22"/>
+                <w:szCs w:val="22"/>
+              </w:rPr>
+            </w:pPr>
+            <w:r>
+              <w:rPr>
+                <w:sz w:val="22"/>
+                <w:szCs w:val="22"/>
+              </w:rPr>
+              <w:t>consulta: 13/09/2026</w:t>
+            </w:r>
+          </w:p>
+        </w:tc>
+      </w:tr>
+      <w:tr>
+        <w:tc>
+          <w:tcPr>
+            <w:tcW w:w="1735" w:type="dxa"/>
+            <w:tcMar>
+              <w:top w:w="60" w:type="dxa"/>
+              <w:left w:w="100" w:type="dxa"/>
+              <w:bottom w:w="60" w:type="dxa"/>
+              <w:right w:w="100" w:type="dxa"/>
+            </w:tcMar>
+            <w:vAlign w:val="center"/>
+          </w:tcPr>
+          <w:p>
+            <w:pPr>
+              <w:spacing w:after="0"/>
+            </w:pPr>
+            <w:proofErr w:type="spellStart"/>
+            <w:r>
+              <w:lastRenderedPageBreak/>
+              <w:t>TrolMaster</w:t>
+            </w:r>
+            <w:proofErr w:type="spellEnd"/>
+            <w:r>
+              <w:t xml:space="preserve"> (control ambiental)</w:t>
+            </w:r>
+          </w:p>
+        </w:tc>
+        <w:tc>
+          <w:tcPr>
+            <w:tcW w:w="1668" w:type="dxa"/>
+            <w:tcMar>
+              <w:top w:w="60" w:type="dxa"/>
+              <w:left w:w="100" w:type="dxa"/>
+              <w:bottom w:w="60" w:type="dxa"/>
+              <w:right w:w="100" w:type="dxa"/>
+            </w:tcMar>
+            <w:vAlign w:val="center"/>
+          </w:tcPr>
+          <w:p>
+            <w:pPr>
+              <w:spacing w:after="0"/>
+            </w:pPr>
+            <w:r>
+              <w:t>Control de clima, riego, dióxido de carbono y ventilación con aplicación asociada</w:t>
+            </w:r>
+          </w:p>
+        </w:tc>
+        <w:tc>
+          <w:tcPr>
+            <w:tcW w:w="1455" w:type="dxa"/>
+            <w:tcMar>
+              <w:top w:w="60" w:type="dxa"/>
+              <w:left w:w="100" w:type="dxa"/>
+              <w:bottom w:w="60" w:type="dxa"/>
+              <w:right w:w="100" w:type="dxa"/>
+            </w:tcMar>
+            <w:vAlign w:val="center"/>
+          </w:tcPr>
+          <w:p>
+            <w:pPr>
+              <w:spacing w:after="0"/>
+            </w:pPr>
+            <w:r>
+              <w:t>Control automático del entorno productivo</w:t>
+            </w:r>
+          </w:p>
+        </w:tc>
+        <w:tc>
+          <w:tcPr>
+            <w:tcW w:w="1628" w:type="dxa"/>
+            <w:tcMar>
+              <w:top w:w="60" w:type="dxa"/>
+              <w:left w:w="100" w:type="dxa"/>
+              <w:bottom w:w="60" w:type="dxa"/>
+              <w:right w:w="100" w:type="dxa"/>
+            </w:tcMar>
+            <w:vAlign w:val="center"/>
+          </w:tcPr>
+          <w:p>
+            <w:pPr>
+              <w:spacing w:after="0"/>
+            </w:pPr>
+            <w:r>
+              <w:t>Ecosistema propietario y costo elevado; prioriza el control sobre la gestión de los datos</w:t>
+            </w:r>
+          </w:p>
+        </w:tc>
+        <w:tc>
+          <w:tcPr>
+            <w:tcW w:w="2865" w:type="dxa"/>
+            <w:tcMar>
+              <w:top w:w="60" w:type="dxa"/>
+              <w:left w:w="100" w:type="dxa"/>
+              <w:bottom w:w="60" w:type="dxa"/>
+              <w:right w:w="100" w:type="dxa"/>
+            </w:tcMar>
+            <w:vAlign w:val="center"/>
+          </w:tcPr>
+          <w:p>
+            <w:pPr>
+              <w:spacing w:after="0"/>
               <w:rPr>
                 <w:sz w:val="22"/>
                 <w:szCs w:val="22"/>
                 <w:lang w:val="en-US"/>
               </w:rPr>
-              <w:t xml:space="preserve">ThinkGrow </w:t>
-            </w:r>
-          </w:p>
-          <w:p>
-            <w:pPr>
-              <w:spacing w:after="0"/>
+            </w:pPr>
+            <w:proofErr w:type="spellStart"/>
+            <w:r>
               <w:rPr>
                 <w:sz w:val="22"/>
                 <w:szCs w:val="22"/>
                 <w:lang w:val="en-US"/>
               </w:rPr>
-            </w:pPr>
+              <w:t>ThinkGrow</w:t>
+            </w:r>
+            <w:proofErr w:type="spellEnd"/>
             <w:r>
               <w:rPr>
                 <w:sz w:val="22"/>
                 <w:szCs w:val="22"/>
                 <w:lang w:val="en-US"/>
               </w:rPr>
-              <w:t xml:space="preserve">Agricultural </w:t>
+              <w:t xml:space="preserve"> </w:t>
             </w:r>
           </w:p>
           <w:p>
@@ -3730,7 +3779,7 @@
                 <w:szCs w:val="22"/>
                 <w:lang w:val="en-US"/>
               </w:rPr>
-              <w:t xml:space="preserve">Technology (s. f.). </w:t>
+              <w:t xml:space="preserve">Agricultural </w:t>
             </w:r>
           </w:p>
           <w:p>
@@ -3739,12 +3788,30 @@
               <w:rPr>
                 <w:sz w:val="22"/>
                 <w:szCs w:val="22"/>
+                <w:lang w:val="en-US"/>
               </w:rPr>
             </w:pPr>
             <w:r>
               <w:rPr>
                 <w:sz w:val="22"/>
                 <w:szCs w:val="22"/>
+                <w:lang w:val="en-US"/>
+              </w:rPr>
+              <w:t xml:space="preserve">Technology (s. f.). </w:t>
+            </w:r>
+          </w:p>
+          <w:p>
+            <w:pPr>
+              <w:spacing w:after="0"/>
+              <w:rPr>
+                <w:sz w:val="22"/>
+                <w:szCs w:val="22"/>
+              </w:rPr>
+            </w:pPr>
+            <w:r>
+              <w:rPr>
+                <w:sz w:val="22"/>
+                <w:szCs w:val="22"/>
               </w:rPr>
               <w:t>https://www.trolmaster.com · consulta: 13/09/2026</w:t>
             </w:r>
@@ -3767,8 +3834,13 @@
             <w:pPr>
               <w:spacing w:after="0"/>
             </w:pPr>
-            <w:r>
-              <w:t>MyCodo (sistema abierto)</w:t>
+            <w:proofErr w:type="spellStart"/>
+            <w:r>
+              <w:t>MyCodo</w:t>
+            </w:r>
+            <w:proofErr w:type="spellEnd"/>
+            <w:r>
+              <w:t xml:space="preserve"> (sistema abierto)</w:t>
             </w:r>
           </w:p>
         </w:tc>
@@ -4089,7 +4161,13 @@
               <w:spacing w:after="0"/>
             </w:pPr>
             <w:r>
-              <w:t>En el ensayo previo de espinaca se medía el pH y la conductividad eléctrica tres veces al día, todos los días, durante el período de desarrollo —veintiuna mediciones por semana—; los valores se usaban en el momento para corregir la solución y no se conservó la serie de las mediciones (comunicación personal, 2026). El informe recoge los rangos de referencia y algunos valores puntuales, y la solución se renovaba cada quince días, cuando el pH o la conductividad eléctrica se desviaban (Santos Navarro, 2020)</w:t>
+              <w:t>En el ensayo previo de espinaca se medía el pH y la conductividad eléctrica tres veces al día, todos los días, durante el período de desarrollo</w:t>
+            </w:r>
+            <w:r>
+              <w:t xml:space="preserve"> </w:t>
+            </w:r>
+            <w:r>
+              <w:t>veintiuna mediciones por semana; los valores se usaban en el momento para corregir la solución y no se conservó la serie de las mediciones (comunicación personal, 2026). El informe recoge los rangos de referencia y algunos valores puntuales, y la solución se renovaba cada quince días, cuando el pH o la conductividad eléctrica se desviaban (Santos Navarro, 2020)</w:t>
             </w:r>
           </w:p>
         </w:tc>
@@ -4222,7 +4300,15 @@
               <w:spacing w:after="0"/>
             </w:pPr>
             <w:r>
-              <w:t>Las desviaciones se advertían por su efecto sobre las plantas: las plántulas se estresaban o caían (comunicación personal, 2026), de modo que el aviso llegaba cuando el daño ya se había producido, que es precisamente lo que un sistema de alerta temprana evita. Los valores que se detectaron tarde quedaron consignados de forma puntual en el informe: el pH llegó a 5,8 en el sistema de raíz flotante y a 5,6 en el NFT, la conductividad eléctrica descendió 0,1 mS/cm y la temperatura de la solución alcanzó 26 °C (Santos Navarro, 2020).</w:t>
+              <w:t xml:space="preserve">Las desviaciones se advertían por su efecto sobre las plantas: las plántulas se estresaban o caían (comunicación personal, 2026), de modo que el aviso llegaba cuando el daño ya se había producido, que es precisamente lo que un sistema de alerta temprana evita. Los valores que se detectaron tarde quedaron consignados de forma puntual en el informe: el pH llegó a 5,8 en el sistema de raíz flotante y a 5,6 en el NFT, la conductividad eléctrica descendió 0,1 </w:t>
+            </w:r>
+            <w:proofErr w:type="spellStart"/>
+            <w:r>
+              <w:t>mS</w:t>
+            </w:r>
+            <w:proofErr w:type="spellEnd"/>
+            <w:r>
+              <w:t>/cm y la temperatura de la solución alcanzó 26 °C (Santos Navarro, 2020).</w:t>
             </w:r>
           </w:p>
         </w:tc>
@@ -4289,11 +4375,19 @@
         <w:t xml:space="preserve"> </w:t>
       </w:r>
       <w:r>
-        <w:t xml:space="preserve">que permite publicar la misma base de código para web y Android, la base de datos documental Cloud Firestore y los módulos de adquisición basados en el microcontrolador ESP32. La integración es viable dentro del plazo del diplomado, tal como lo evidencian los antecedentes tecnológicos relevados (Cruz Cerruto, 2019; Baldiviezo Mercado, 2019), y la disponibilidad de sensores económicos en el mercado local refuerza la viabilidad económica. La factibilidad obliga, en cambio, a delimitar el alcance: el sistema gestiona y </w:t>
+        <w:t xml:space="preserve">que permite publicar la misma base de código para web y Android, la base de datos documental Cloud Firestore y los módulos de adquisición basados en el </w:t>
       </w:r>
       <w:r>
         <w:lastRenderedPageBreak/>
-        <w:t>monitorea las variables, pero no controla actuadores, de modo que el compromiso asumido sea alcanzable y verificable.</w:t>
+        <w:t xml:space="preserve">microcontrolador ESP32. La integración es viable dentro del plazo del diplomado, tal como lo evidencian los antecedentes tecnológicos relevados (Cruz Cerruto, 2019; </w:t>
+      </w:r>
+      <w:proofErr w:type="spellStart"/>
+      <w:r>
+        <w:t>Baldiviezo</w:t>
+      </w:r>
+      <w:proofErr w:type="spellEnd"/>
+      <w:r>
+        <w:t xml:space="preserve"> Mercado, 2019), y la disponibilidad de sensores económicos en el mercado local refuerza la viabilidad económica. La factibilidad obliga, en cambio, a delimitar el alcance: el sistema gestiona y monitorea las variables, pero no controla actuadores, de modo que el compromiso asumido sea alcanzable y verificable.</w:t>
       </w:r>
     </w:p>
     <w:p>
@@ -4355,18 +4449,20 @@
         <w:jc w:val="both"/>
       </w:pPr>
       <w:r>
-        <w:t>Desarrollar el sistema de gestión de variables SI.G.VA.C.H., una aplicación móvil y web que permita el registro, la visualización y el seguimiento de las variables fisicoquímicas y ambientales de un cultivo hidropónico mediante rangos de referencia, para uso de productores, investigadores y estudiantes.</w:t>
-      </w:r>
-    </w:p>
-    <w:p>
-      <w:pPr>
-        <w:jc w:val="both"/>
-      </w:pPr>
-    </w:p>
-    <w:p>
-      <w:pPr>
-        <w:jc w:val="both"/>
-      </w:pPr>
+        <w:t xml:space="preserve">Desarrollar el sistema de gestión de variables </w:t>
+      </w:r>
+      <w:proofErr w:type="gramStart"/>
+      <w:r>
+        <w:t>SI.G.VA.C.H.</w:t>
+      </w:r>
+      <w:proofErr w:type="gramEnd"/>
+      <w:r>
+        <w:t xml:space="preserve">, una aplicación móvil y web que permita el registro, la visualización y el seguimiento de las </w:t>
+      </w:r>
+      <w:r>
+        <w:lastRenderedPageBreak/>
+        <w:t>variables fisicoquímicas y ambientales de un cultivo hidropónico mediante rangos de referencia, para uso de productores, investigadores y estudiantes.</w:t>
+      </w:r>
     </w:p>
     <w:p>
       <w:pPr>
@@ -4379,7 +4475,6 @@
           <w:sz w:val="26"/>
           <w:szCs w:val="26"/>
         </w:rPr>
-        <w:lastRenderedPageBreak/>
         <w:t>1.5.2 Objetivos específicos</w:t>
       </w:r>
       <w:bookmarkEnd w:id="7"/>
@@ -4523,6 +4618,7 @@
                 <w:b/>
                 <w:bCs/>
               </w:rPr>
+              <w:lastRenderedPageBreak/>
               <w:t>N.º</w:t>
             </w:r>
           </w:p>
@@ -4661,11 +4757,7 @@
               <w:t>especificando</w:t>
             </w:r>
             <w:r>
-              <w:t xml:space="preserve"> los </w:t>
-            </w:r>
-            <w:r>
-              <w:lastRenderedPageBreak/>
-              <w:t>requisitos funcionales y no funcionales con sus criterios de aceptación.</w:t>
+              <w:t xml:space="preserve"> los requisitos funcionales y no funcionales con sus criterios de aceptación.</w:t>
             </w:r>
           </w:p>
         </w:tc>
@@ -4682,7 +4774,6 @@
           </w:tcPr>
           <w:p>
             <w:r>
-              <w:lastRenderedPageBreak/>
               <w:t>2.3 Análisis de requisitos</w:t>
             </w:r>
           </w:p>
@@ -4894,7 +4985,11 @@
               <w:jc w:val="both"/>
             </w:pPr>
             <w:r>
-              <w:t>Aplicar los mecanismos de seguridad correspondientes: autenticación de usuarios, control de acceso por rol, validación de las entradas y gestión de las credenciales mediante variables de entorno.</w:t>
+              <w:t xml:space="preserve">Aplicar los mecanismos de seguridad correspondientes: autenticación de usuarios, control de acceso por rol, validación de las entradas y gestión de las </w:t>
+            </w:r>
+            <w:r>
+              <w:lastRenderedPageBreak/>
+              <w:t>credenciales mediante variables de entorno.</w:t>
             </w:r>
           </w:p>
         </w:tc>
@@ -4911,6 +5006,7 @@
           </w:tcPr>
           <w:p>
             <w:r>
+              <w:lastRenderedPageBreak/>
               <w:t>2.7 Seguridad</w:t>
             </w:r>
           </w:p>
@@ -4970,11 +5066,7 @@
               <w:jc w:val="both"/>
             </w:pPr>
             <w:r>
-              <w:t xml:space="preserve">Ejecutar las pruebas funcionales y de usabilidad del sistema, con sus </w:t>
-            </w:r>
-            <w:r>
-              <w:lastRenderedPageBreak/>
-              <w:t>casos de prueba documentados y los resultados obtenidos, e incorporar las correcciones que de ellas se deriven.</w:t>
+              <w:t>Ejecutar las pruebas funcionales y de usabilidad del sistema, con sus casos de prueba documentados y los resultados obtenidos, e incorporar las correcciones que de ellas se deriven.</w:t>
             </w:r>
           </w:p>
         </w:tc>
@@ -4991,7 +5083,6 @@
           </w:tcPr>
           <w:p>
             <w:r>
-              <w:lastRenderedPageBreak/>
               <w:t>2.8 Pruebas</w:t>
             </w:r>
           </w:p>
@@ -5205,7 +5296,31 @@
         <w:jc w:val="both"/>
       </w:pPr>
       <w:r>
-        <w:t>La hidroponía es una técnica de producción vegetal sin suelo en la que las plantas reciben los nutrientes mediante una solución nutritiva (Resh, 2013). Entre las modalidades más difundidas se encuentran el sistema de raíz flotante, en el que las plantas se mantienen sobre una lámina de solución nutritiva, y el sistema NFT (Nutrient Film Technique), en el que la solución circula de forma continua por canales (Jensen, 1997). Ambos sistemas han sido estudiados en el ámbito local de la Universidad Autónoma "Juan Misael Saracho" (Tejerina Pinto, 2018; Santos Navarro, 2020), lo que fundamenta la elección del dominio del presente proyecto.</w:t>
+        <w:t>La hidroponía es una técnica de producción vegetal sin suelo en la que las plantas reciben los nutrientes mediante una solución nutritiva (</w:t>
+      </w:r>
+      <w:proofErr w:type="spellStart"/>
+      <w:r>
+        <w:t>Resh</w:t>
+      </w:r>
+      <w:proofErr w:type="spellEnd"/>
+      <w:r>
+        <w:t>, 2013). Entre las modalidades más difundidas se encuentran el sistema de raíz flotante, en el que las plantas se mantienen sobre una lámina de solución nutritiva, y el sistema NFT (</w:t>
+      </w:r>
+      <w:proofErr w:type="spellStart"/>
+      <w:r>
+        <w:t>Nutrient</w:t>
+      </w:r>
+      <w:proofErr w:type="spellEnd"/>
+      <w:r>
+        <w:t xml:space="preserve"> Film </w:t>
+      </w:r>
+      <w:proofErr w:type="spellStart"/>
+      <w:r>
+        <w:t>Technique</w:t>
+      </w:r>
+      <w:proofErr w:type="spellEnd"/>
+      <w:r>
+        <w:t>), en el que la solución circula de forma continua por canales (Jensen, 1997). Ambos sistemas han sido estudiados en el ámbito local de la Universidad Autónoma "Juan Misael Saracho" (Tejerina Pinto, 2018; Santos Navarro, 2020), lo que fundamenta la elección del dominio del presente proyecto.</w:t>
       </w:r>
     </w:p>
     <w:p>
@@ -5213,7 +5328,15 @@
         <w:jc w:val="both"/>
       </w:pPr>
       <w:r>
-        <w:t>El adecuado desarrollo del cultivo depende del mantenimiento de las variables fisicoquímicas de la solución nutritiva y de las variables ambientales del entorno. Las variables gestionadas por SI.G.VA.C.H. son el pH, los sólidos disueltos totales (TDS), la conductividad eléctrica (EC), la temperatura de la solución nutritiva, la temperatura ambiental y la humedad relativa. Cada variable debe permanecer dentro de un rango de referencia apropiado para el cultivo; la Tabla 5 presenta los rangos referenciales considerados para los perfiles de cultivo predefinidos en el sistema. Conviene precisar que la conductividad eléctrica mide la capacidad de la solución para conducir la corriente iónica, mientras que los sólidos disueltos totales estiman la concentración de sales disueltas en ella: el registro conjunto de ambas permite valorar la calidad de la solución nutritiva.</w:t>
+        <w:t xml:space="preserve">El adecuado desarrollo del cultivo depende del mantenimiento de las variables fisicoquímicas de la solución nutritiva y de las variables ambientales del entorno. Las variables gestionadas por </w:t>
+      </w:r>
+      <w:proofErr w:type="gramStart"/>
+      <w:r>
+        <w:t>SI.G.VA.C.H.</w:t>
+      </w:r>
+      <w:proofErr w:type="gramEnd"/>
+      <w:r>
+        <w:t xml:space="preserve"> son el pH, los sólidos disueltos totales (TDS), la conductividad eléctrica (EC), la temperatura de la solución nutritiva, la temperatura ambiental y la humedad relativa. Cada variable debe permanecer dentro de un rango de referencia apropiado para el cultivo; la Tabla 5 presenta los rangos referenciales considerados para los perfiles de cultivo predefinidos en el sistema. Conviene precisar que la conductividad eléctrica mide la capacidad de la solución para conducir la corriente iónica, mientras que los sólidos disueltos totales estiman la concentración de sales disueltas en ella: el registro conjunto de ambas permite valorar la calidad de la solución nutritiva.</w:t>
       </w:r>
     </w:p>
     <w:p>
@@ -5571,12 +5694,21 @@
             <w:pPr>
               <w:spacing w:before="40" w:after="40"/>
             </w:pPr>
+            <w:proofErr w:type="spellStart"/>
             <w:r>
               <w:rPr>
                 <w:sz w:val="20"/>
                 <w:szCs w:val="20"/>
               </w:rPr>
-              <w:t>mS/cm</w:t>
+              <w:t>mS</w:t>
+            </w:r>
+            <w:proofErr w:type="spellEnd"/>
+            <w:r>
+              <w:rPr>
+                <w:sz w:val="20"/>
+                <w:szCs w:val="20"/>
+              </w:rPr>
+              <w:t>/cm</w:t>
             </w:r>
           </w:p>
         </w:tc>
@@ -6137,7 +6269,21 @@
         <w:rPr>
           <w:i/>
         </w:rPr>
-        <w:t>Fuente: Elaboración propia con base en Resh (2013) y Urrestarazu (2004).</w:t>
+        <w:t xml:space="preserve">Fuente: Elaboración propia con base en </w:t>
+      </w:r>
+      <w:proofErr w:type="spellStart"/>
+      <w:r>
+        <w:rPr>
+          <w:i/>
+        </w:rPr>
+        <w:t>Resh</w:t>
+      </w:r>
+      <w:proofErr w:type="spellEnd"/>
+      <w:r>
+        <w:rPr>
+          <w:i/>
+        </w:rPr>
+        <w:t xml:space="preserve"> (2013) y Urrestarazu (2004).</w:t>
       </w:r>
     </w:p>
     <w:p>
@@ -6192,7 +6338,15 @@
         <w:t>EC y TDS:</w:t>
       </w:r>
       <w:r>
-        <w:t xml:space="preserve"> sonda de conductividad que estima los sólidos disueltos totales (mS/cm y ppm).</w:t>
+        <w:t xml:space="preserve"> sonda de conductividad que estima los sólidos disueltos totales (</w:t>
+      </w:r>
+      <w:proofErr w:type="spellStart"/>
+      <w:r>
+        <w:t>mS</w:t>
+      </w:r>
+      <w:proofErr w:type="spellEnd"/>
+      <w:r>
+        <w:t>/cm y ppm).</w:t>
       </w:r>
     </w:p>
     <w:p>
@@ -6257,7 +6411,23 @@
         <w:jc w:val="both"/>
       </w:pPr>
       <w:r>
-        <w:t>El Internet de las Cosas (IoT) aplicado a la agricultura permite capturar, transmitir y analizar información del cultivo de forma continua mediante dispositivos conectados a la red (Tzounis et al., 2017). El presente proyecto emplea el microcontrolador ESP32, que integra conectividad Wi-Fi y Bluetooth, múltiples entradas analógicas y digitales y un costo reducido, lo que lo hace adecuado para prototipos de bajo costo; el modelo y la versión del firmware se consignan en el apartado 2.5, dado que su selección depende de la caracterización del módulo piloto.</w:t>
+        <w:t>El Internet de las Cosas (IoT) aplicado a la agricultura permite capturar, transmitir y analizar información del cultivo de forma continua mediante dispositivos conectados a la red (</w:t>
+      </w:r>
+      <w:proofErr w:type="spellStart"/>
+      <w:r>
+        <w:t>Tzounis</w:t>
+      </w:r>
+      <w:proofErr w:type="spellEnd"/>
+      <w:r>
+        <w:t xml:space="preserve"> et al., 2017). El presente proyecto emplea el microcontrolador ESP32, que integra conectividad </w:t>
+      </w:r>
+      <w:proofErr w:type="spellStart"/>
+      <w:r>
+        <w:t>Wi</w:t>
+      </w:r>
+      <w:proofErr w:type="spellEnd"/>
+      <w:r>
+        <w:t>-Fi y Bluetooth, múltiples entradas analógicas y digitales y un costo reducido, lo que lo hace adecuado para prototipos de bajo costo; el modelo y la versión del firmware se consignan en el apartado 2.5, dado que su selección depende de la caracterización del módulo piloto.</w:t>
       </w:r>
     </w:p>
     <w:p>
@@ -6284,7 +6454,23 @@
         <w:jc w:val="both"/>
       </w:pPr>
       <w:r>
-        <w:t>Cloud Firestore es una base de datos NoSQL orientada a documentos, ofrecida por Firebase (Google), que almacena los datos en colecciones y documentos y permite sincronización en tiempo real; en el proyecto se emplea a través del SDK cloud_firestore 6.9.0, sobre firebase_core 4.14.0. Entre sus características relevantes para el proyecto se encuentran su modelo flexible de datos, las reglas de seguridad configurables por colección, la disponibilidad de un SDK de administración para el servidor y un plan gratuito suficiente para un prototipo.</w:t>
+        <w:t xml:space="preserve">Cloud Firestore es una base de datos NoSQL orientada a documentos, ofrecida por Firebase (Google), que almacena los datos en colecciones y documentos y permite sincronización en tiempo real; en el proyecto se emplea a través del SDK </w:t>
+      </w:r>
+      <w:proofErr w:type="spellStart"/>
+      <w:r>
+        <w:t>cloud_firestore</w:t>
+      </w:r>
+      <w:proofErr w:type="spellEnd"/>
+      <w:r>
+        <w:t xml:space="preserve"> 6.9.0, sobre </w:t>
+      </w:r>
+      <w:proofErr w:type="spellStart"/>
+      <w:r>
+        <w:t>firebase_core</w:t>
+      </w:r>
+      <w:proofErr w:type="spellEnd"/>
+      <w:r>
+        <w:t xml:space="preserve"> 4.14.0. Entre sus características relevantes para el proyecto se encuentran su modelo flexible de datos, las reglas de seguridad configurables por colección, la disponibilidad de un SDK de administración para el servidor y un plan gratuito suficiente para un prototipo.</w:t>
       </w:r>
     </w:p>
     <w:p>
@@ -6292,7 +6478,15 @@
         <w:jc w:val="both"/>
       </w:pPr>
       <w:r>
-        <w:t xml:space="preserve">En el sistema SI.G.VA.C.H., Firestore almacena la información de los usuarios, los módulos de cultivo, las variables, los rangos de referencia, las lecturas </w:t>
+        <w:t xml:space="preserve">En el sistema </w:t>
+      </w:r>
+      <w:proofErr w:type="gramStart"/>
+      <w:r>
+        <w:t>SI.G.VA.C.H.</w:t>
+      </w:r>
+      <w:proofErr w:type="gramEnd"/>
+      <w:r>
+        <w:t xml:space="preserve">, Firestore almacena la información de los usuarios, los módulos de cultivo, las variables, los rangos de referencia, las lecturas </w:t>
       </w:r>
       <w:r>
         <w:lastRenderedPageBreak/>
@@ -6317,21 +6511,41 @@
       <w:r>
         <w:t xml:space="preserve">Flutter es un </w:t>
       </w:r>
+      <w:proofErr w:type="spellStart"/>
       <w:r>
         <w:rPr>
           <w:i/>
         </w:rPr>
         <w:t>framework</w:t>
       </w:r>
-      <w:r>
-        <w:t xml:space="preserve"> de código abierto desarrollado por Google para construir interfaces de usuario compiladas de forma nativa a partir de un único código base en el lenguaje Dart; el proyecto se desarrolla sobre la versión 3.44.8 del canal estable, con Dart 3.12.2. Permite generar aplicaciones para dispositivos móviles (Android e iOS) y para la web, lo que satisface el requisito del proyecto de disponer de una aplicación móvil y web con una única base de código. Su gestión de estado, la biblioteca de componentes Material Design y el soporte de gráficos y animaciones facilitan la construcción del panel de visualización (</w:t>
-      </w:r>
+      <w:proofErr w:type="spellEnd"/>
+      <w:r>
+        <w:t xml:space="preserve"> de código abierto desarrollado por Google para construir interfaces de usuario compiladas de forma nativa a partir de un único código base en el lenguaje Dart; el proyecto se desarrolla sobre la versión 3.44.8 del canal estable, con Dart 3.12.2. Permite generar aplicaciones para dispositivos móviles (Android </w:t>
+      </w:r>
+      <w:proofErr w:type="gramStart"/>
+      <w:r>
+        <w:t>e</w:t>
+      </w:r>
+      <w:proofErr w:type="gramEnd"/>
+      <w:r>
+        <w:t xml:space="preserve"> iOS) y para la web, lo que satisface el requisito del proyecto de disponer de una aplicación móvil y web con una única base de código. Su gestión de estado, la biblioteca de componentes Material </w:t>
+      </w:r>
+      <w:proofErr w:type="spellStart"/>
+      <w:r>
+        <w:t>Design</w:t>
+      </w:r>
+      <w:proofErr w:type="spellEnd"/>
+      <w:r>
+        <w:t xml:space="preserve"> y el soporte de gráficos y animaciones facilitan la construcción del panel de visualización (</w:t>
+      </w:r>
+      <w:proofErr w:type="spellStart"/>
       <w:r>
         <w:rPr>
           <w:i/>
         </w:rPr>
         <w:t>dashboard</w:t>
       </w:r>
+      <w:proofErr w:type="spellEnd"/>
       <w:r>
         <w:t>) del sistema.</w:t>
       </w:r>
@@ -6392,7 +6606,15 @@
         <w:t xml:space="preserve">Marco de trabajo adoptado: </w:t>
       </w:r>
       <w:r>
-        <w:t>Scrum reducido con sprints de una semana, complementado con un tablero Kanban con límite de trabajo en curso de dos tarjetas.</w:t>
+        <w:t xml:space="preserve">Scrum reducido con </w:t>
+      </w:r>
+      <w:proofErr w:type="spellStart"/>
+      <w:r>
+        <w:t>sprints</w:t>
+      </w:r>
+      <w:proofErr w:type="spellEnd"/>
+      <w:r>
+        <w:t xml:space="preserve"> de una semana, complementado con un tablero Kanban con límite de trabajo en curso de dos tarjetas.</w:t>
       </w:r>
     </w:p>
     <w:p>
@@ -6406,7 +6628,15 @@
         <w:t xml:space="preserve">Justificación de la elección: </w:t>
       </w:r>
       <w:r>
-        <w:t>Scrum permite entregar incrementos funcionales verificables en iteraciones cortas y priorizar los requisitos de mayor valor, condiciones que se ajustan a un proyecto monográfico con entregas semanales. El marco se aplica de forma reducida: el participante asume los roles de responsable del producto y de equipo de desarrollo, el tutor valida cada incremento en la tutoría semanal y las ceremonias se limitan a las que un proyecto individual puede evidenciar: planificación del sprint, revisión con el tutor y retrospectiva. El límite de trabajo en curso se fija en dos tarjetas para evitar la dispersión en una sola persona, que es el riesgo principal de este tipo de proyecto. La evidencia de aplicación son el plan de sprints de la Tabla 6, el tablero de la Figura 1 y el historial de confirmaciones del repositorio.</w:t>
+        <w:t xml:space="preserve">Scrum permite entregar incrementos funcionales verificables en iteraciones cortas y priorizar los requisitos de mayor valor, condiciones que se ajustan a un proyecto monográfico con entregas semanales. El marco se aplica de forma reducida: el participante asume los roles de responsable del producto y de equipo de desarrollo, el tutor valida cada incremento en la tutoría semanal y las ceremonias se limitan a las que un proyecto individual puede evidenciar: planificación del sprint, revisión con el tutor y retrospectiva. El límite de trabajo en curso se fija en dos tarjetas para evitar la dispersión en una sola persona, que es el riesgo principal de este tipo de proyecto. La evidencia de aplicación son el plan de </w:t>
+      </w:r>
+      <w:proofErr w:type="spellStart"/>
+      <w:r>
+        <w:t>sprints</w:t>
+      </w:r>
+      <w:proofErr w:type="spellEnd"/>
+      <w:r>
+        <w:t xml:space="preserve"> de la Tabla 6, el tablero de la Figura 1 y el historial de confirmaciones del repositorio.</w:t>
       </w:r>
     </w:p>
     <w:tbl>
@@ -6578,7 +6808,15 @@
               <w:spacing w:after="0"/>
             </w:pPr>
             <w:r>
-              <w:t>1 (11–20 sep)</w:t>
+              <w:t xml:space="preserve">1 (11–20 </w:t>
+            </w:r>
+            <w:proofErr w:type="spellStart"/>
+            <w:r>
+              <w:t>sep</w:t>
+            </w:r>
+            <w:proofErr w:type="spellEnd"/>
+            <w:r>
+              <w:t>)</w:t>
             </w:r>
           </w:p>
         </w:tc>
@@ -6661,7 +6899,15 @@
               <w:spacing w:after="0"/>
             </w:pPr>
             <w:r>
-              <w:t>2 (21–27 sep)</w:t>
+              <w:t xml:space="preserve">2 (21–27 </w:t>
+            </w:r>
+            <w:proofErr w:type="spellStart"/>
+            <w:r>
+              <w:t>sep</w:t>
+            </w:r>
+            <w:proofErr w:type="spellEnd"/>
+            <w:r>
+              <w:t>)</w:t>
             </w:r>
           </w:p>
         </w:tc>
@@ -6749,7 +6995,15 @@
               <w:spacing w:after="0"/>
             </w:pPr>
             <w:r>
-              <w:t>3 (28 sep – 4 oct)</w:t>
+              <w:t xml:space="preserve">3 (28 </w:t>
+            </w:r>
+            <w:proofErr w:type="spellStart"/>
+            <w:r>
+              <w:t>sep</w:t>
+            </w:r>
+            <w:proofErr w:type="spellEnd"/>
+            <w:r>
+              <w:t xml:space="preserve"> – 4 oct)</w:t>
             </w:r>
           </w:p>
         </w:tc>
@@ -6894,7 +7148,27 @@
           <w:sz w:val="20"/>
           <w:szCs w:val="20"/>
         </w:rPr>
-        <w:t>Tabla 6. Plan de sprints. Fuente: elaboración propia.</w:t>
+        <w:t xml:space="preserve">Tabla 6. Plan de </w:t>
+      </w:r>
+      <w:proofErr w:type="spellStart"/>
+      <w:r>
+        <w:rPr>
+          <w:i/>
+          <w:iCs/>
+          <w:sz w:val="20"/>
+          <w:szCs w:val="20"/>
+        </w:rPr>
+        <w:t>sprints</w:t>
+      </w:r>
+      <w:proofErr w:type="spellEnd"/>
+      <w:r>
+        <w:rPr>
+          <w:i/>
+          <w:iCs/>
+          <w:sz w:val="20"/>
+          <w:szCs w:val="20"/>
+        </w:rPr>
+        <w:t>. Fuente: elaboración propia.</w:t>
       </w:r>
     </w:p>
     <w:p>
@@ -7632,6 +7906,7 @@
               <w:spacing w:after="0"/>
               <w:jc w:val="center"/>
             </w:pPr>
+            <w:proofErr w:type="spellStart"/>
             <w:r>
               <w:rPr>
                 <w:b/>
@@ -7641,6 +7916,7 @@
               </w:rPr>
               <w:t>MoSCoW</w:t>
             </w:r>
+            <w:proofErr w:type="spellEnd"/>
           </w:p>
         </w:tc>
       </w:tr>
@@ -7723,9 +7999,11 @@
               <w:spacing w:after="0"/>
               <w:jc w:val="center"/>
             </w:pPr>
+            <w:proofErr w:type="spellStart"/>
             <w:r>
               <w:t>Must</w:t>
             </w:r>
+            <w:proofErr w:type="spellEnd"/>
           </w:p>
         </w:tc>
       </w:tr>
@@ -7808,9 +8086,11 @@
               <w:spacing w:after="0"/>
               <w:jc w:val="center"/>
             </w:pPr>
+            <w:proofErr w:type="spellStart"/>
             <w:r>
               <w:t>Should</w:t>
             </w:r>
+            <w:proofErr w:type="spellEnd"/>
           </w:p>
         </w:tc>
       </w:tr>
@@ -7893,9 +8173,11 @@
               <w:spacing w:after="0"/>
               <w:jc w:val="center"/>
             </w:pPr>
+            <w:proofErr w:type="spellStart"/>
             <w:r>
               <w:t>Must</w:t>
             </w:r>
+            <w:proofErr w:type="spellEnd"/>
           </w:p>
         </w:tc>
       </w:tr>
@@ -7979,9 +8261,11 @@
               <w:spacing w:after="0"/>
               <w:jc w:val="center"/>
             </w:pPr>
+            <w:proofErr w:type="spellStart"/>
             <w:r>
               <w:t>Should</w:t>
             </w:r>
+            <w:proofErr w:type="spellEnd"/>
           </w:p>
         </w:tc>
       </w:tr>
@@ -8064,9 +8348,11 @@
               <w:spacing w:after="0"/>
               <w:jc w:val="center"/>
             </w:pPr>
+            <w:proofErr w:type="spellStart"/>
             <w:r>
               <w:t>Must</w:t>
             </w:r>
+            <w:proofErr w:type="spellEnd"/>
           </w:p>
         </w:tc>
       </w:tr>
@@ -8149,9 +8435,11 @@
               <w:spacing w:after="0"/>
               <w:jc w:val="center"/>
             </w:pPr>
+            <w:proofErr w:type="spellStart"/>
             <w:r>
               <w:t>Must</w:t>
             </w:r>
+            <w:proofErr w:type="spellEnd"/>
           </w:p>
         </w:tc>
       </w:tr>
@@ -8235,9 +8523,11 @@
               <w:spacing w:after="0"/>
               <w:jc w:val="center"/>
             </w:pPr>
+            <w:proofErr w:type="spellStart"/>
             <w:r>
               <w:t>Should</w:t>
             </w:r>
+            <w:proofErr w:type="spellEnd"/>
           </w:p>
         </w:tc>
       </w:tr>
@@ -8320,9 +8610,11 @@
               <w:spacing w:after="0"/>
               <w:jc w:val="center"/>
             </w:pPr>
+            <w:proofErr w:type="spellStart"/>
             <w:r>
               <w:t>Must</w:t>
             </w:r>
+            <w:proofErr w:type="spellEnd"/>
           </w:p>
         </w:tc>
       </w:tr>
@@ -8405,9 +8697,11 @@
               <w:spacing w:after="0"/>
               <w:jc w:val="center"/>
             </w:pPr>
+            <w:proofErr w:type="spellStart"/>
             <w:r>
               <w:t>Must</w:t>
             </w:r>
+            <w:proofErr w:type="spellEnd"/>
           </w:p>
         </w:tc>
       </w:tr>
@@ -8491,9 +8785,11 @@
               <w:spacing w:after="0"/>
               <w:jc w:val="center"/>
             </w:pPr>
+            <w:proofErr w:type="spellStart"/>
             <w:r>
               <w:t>Should</w:t>
             </w:r>
+            <w:proofErr w:type="spellEnd"/>
           </w:p>
         </w:tc>
       </w:tr>
@@ -8576,9 +8872,11 @@
               <w:spacing w:after="0"/>
               <w:jc w:val="center"/>
             </w:pPr>
+            <w:proofErr w:type="spellStart"/>
             <w:r>
               <w:t>Must</w:t>
             </w:r>
+            <w:proofErr w:type="spellEnd"/>
           </w:p>
         </w:tc>
       </w:tr>
@@ -8661,9 +8959,11 @@
               <w:spacing w:after="0"/>
               <w:jc w:val="center"/>
             </w:pPr>
+            <w:proofErr w:type="spellStart"/>
             <w:r>
               <w:t>Should</w:t>
             </w:r>
+            <w:proofErr w:type="spellEnd"/>
           </w:p>
         </w:tc>
       </w:tr>
@@ -8727,13 +9027,21 @@
               <w:jc w:val="both"/>
             </w:pPr>
             <w:r>
-              <w:t>CA-13.1 Dada una consulta con resultados, cuando se exporta, entonces el archivo contiene exactamente esas lecturas con sus encabezados. CA-13.2 Dada una consulta sin resultados, cuando se exporta, entonces el sistema informa que no hay datos qu</w:t>
+              <w:t xml:space="preserve">CA-13.1 Dada una consulta con resultados, cuando se exporta, entonces el archivo contiene exactamente esas lecturas con sus encabezados. CA-13.2 Dada una consulta sin resultados, cuando se exporta, entonces el sistema informa que no hay datos </w:t>
+            </w:r>
+            <w:proofErr w:type="spellStart"/>
+            <w:r>
+              <w:t>qu</w:t>
             </w:r>
             <w:r>
               <w:t>º</w:t>
             </w:r>
             <w:r>
-              <w:t>e exportar y no genera un archivo vacío.</w:t>
+              <w:t>e</w:t>
+            </w:r>
+            <w:proofErr w:type="spellEnd"/>
+            <w:r>
+              <w:t xml:space="preserve"> exportar y no genera un archivo vacío.</w:t>
             </w:r>
           </w:p>
         </w:tc>
@@ -8753,9 +9061,11 @@
               <w:spacing w:after="0"/>
               <w:jc w:val="center"/>
             </w:pPr>
+            <w:proofErr w:type="spellStart"/>
             <w:r>
               <w:t>Could</w:t>
             </w:r>
+            <w:proofErr w:type="spellEnd"/>
           </w:p>
         </w:tc>
       </w:tr>
@@ -8778,6 +9088,7 @@
       <w:pPr>
         <w:jc w:val="both"/>
       </w:pPr>
+      <w:proofErr w:type="gramStart"/>
       <w:r>
         <w:rPr>
           <w:b/>
@@ -8785,6 +9096,7 @@
         </w:rPr>
         <w:t>Total</w:t>
       </w:r>
+      <w:proofErr w:type="gramEnd"/>
       <w:r>
         <w:rPr>
           <w:b/>
@@ -8792,14 +9104,51 @@
         </w:rPr>
         <w:t xml:space="preserve"> de requisitos: 13 · </w:t>
       </w:r>
-      <w:r>
-        <w:t>Must have: 7 · Porcentaje Must have: 53,8 % (debe ser ≤ 60 %) El requisito RF-04 catálogo de las seis variables</w:t>
-      </w:r>
+      <w:proofErr w:type="spellStart"/>
+      <w:r>
+        <w:t>Must</w:t>
+      </w:r>
+      <w:proofErr w:type="spellEnd"/>
       <w:r>
         <w:t xml:space="preserve"> </w:t>
       </w:r>
-      <w:r>
-        <w:t>se clasifica como Should porque el catálogo se entrega cargado en el servicio como dato inicial, de modo que el diccionario y la evaluación de rangos (RF-09) no dependen de un requisito diferido.</w:t>
+      <w:proofErr w:type="spellStart"/>
+      <w:r>
+        <w:t>have</w:t>
+      </w:r>
+      <w:proofErr w:type="spellEnd"/>
+      <w:r>
+        <w:t xml:space="preserve">: 7 · Porcentaje </w:t>
+      </w:r>
+      <w:proofErr w:type="spellStart"/>
+      <w:r>
+        <w:t>Must</w:t>
+      </w:r>
+      <w:proofErr w:type="spellEnd"/>
+      <w:r>
+        <w:t xml:space="preserve"> </w:t>
+      </w:r>
+      <w:proofErr w:type="spellStart"/>
+      <w:r>
+        <w:t>have</w:t>
+      </w:r>
+      <w:proofErr w:type="spellEnd"/>
+      <w:r>
+        <w:t>: 53,8 % (debe ser ≤ 60 %) El requisito RF-04 catálogo de las seis variables</w:t>
+      </w:r>
+      <w:r>
+        <w:t xml:space="preserve"> </w:t>
+      </w:r>
+      <w:r>
+        <w:t xml:space="preserve">se clasifica como </w:t>
+      </w:r>
+      <w:proofErr w:type="spellStart"/>
+      <w:r>
+        <w:t>Should</w:t>
+      </w:r>
+      <w:proofErr w:type="spellEnd"/>
+      <w:r>
+        <w:t xml:space="preserve"> porque el catálogo se entrega cargado en el servicio como dato inicial, de modo que el diccionario y la evaluación de rangos (RF-09) no dependen de un requisito diferido.</w:t>
       </w:r>
     </w:p>
     <w:p>
@@ -9365,7 +9714,15 @@
             </w:pPr>
             <w:r>
               <w:lastRenderedPageBreak/>
-              <w:t xml:space="preserve">Invocación del endpoint de salud tras quince minutos sin uso y medición del </w:t>
+              <w:t xml:space="preserve">Invocación del </w:t>
+            </w:r>
+            <w:proofErr w:type="spellStart"/>
+            <w:r>
+              <w:t>endpoint</w:t>
+            </w:r>
+            <w:proofErr w:type="spellEnd"/>
+            <w:r>
+              <w:t xml:space="preserve"> de salud tras quince minutos sin uso y medición del </w:t>
             </w:r>
             <w:r>
               <w:lastRenderedPageBreak/>
@@ -9756,6 +10113,7 @@
               <w:spacing w:before="60" w:after="0"/>
               <w:jc w:val="center"/>
             </w:pPr>
+            <w:proofErr w:type="spellStart"/>
             <w:r>
               <w:rPr>
                 <w:b/>
@@ -9763,6 +10121,7 @@
               </w:rPr>
               <w:t>MoSCoW</w:t>
             </w:r>
+            <w:proofErr w:type="spellEnd"/>
           </w:p>
         </w:tc>
         <w:tc>
@@ -9829,9 +10188,11 @@
               <w:spacing w:after="0"/>
               <w:jc w:val="center"/>
             </w:pPr>
+            <w:proofErr w:type="spellStart"/>
             <w:r>
               <w:t>Won't</w:t>
             </w:r>
+            <w:proofErr w:type="spellEnd"/>
           </w:p>
         </w:tc>
         <w:tc>
@@ -9892,9 +10253,11 @@
               <w:spacing w:after="0"/>
               <w:jc w:val="center"/>
             </w:pPr>
+            <w:proofErr w:type="spellStart"/>
             <w:r>
               <w:t>Won't</w:t>
             </w:r>
+            <w:proofErr w:type="spellEnd"/>
           </w:p>
         </w:tc>
         <w:tc>
@@ -9955,9 +10318,11 @@
               <w:spacing w:after="0"/>
               <w:jc w:val="center"/>
             </w:pPr>
+            <w:proofErr w:type="spellStart"/>
             <w:r>
               <w:t>Won't</w:t>
             </w:r>
+            <w:proofErr w:type="spellEnd"/>
           </w:p>
         </w:tc>
         <w:tc>
@@ -10018,9 +10383,11 @@
               <w:spacing w:after="0"/>
               <w:jc w:val="center"/>
             </w:pPr>
+            <w:proofErr w:type="spellStart"/>
             <w:r>
               <w:t>Could</w:t>
             </w:r>
+            <w:proofErr w:type="spellEnd"/>
           </w:p>
         </w:tc>
         <w:tc>
@@ -10081,9 +10448,11 @@
               <w:spacing w:after="0"/>
               <w:jc w:val="center"/>
             </w:pPr>
+            <w:proofErr w:type="spellStart"/>
             <w:r>
               <w:t>Could</w:t>
             </w:r>
+            <w:proofErr w:type="spellEnd"/>
           </w:p>
         </w:tc>
         <w:tc>
@@ -10144,9 +10513,11 @@
               <w:spacing w:after="0"/>
               <w:jc w:val="center"/>
             </w:pPr>
+            <w:proofErr w:type="spellStart"/>
             <w:r>
               <w:t>Won't</w:t>
             </w:r>
+            <w:proofErr w:type="spellEnd"/>
           </w:p>
         </w:tc>
         <w:tc>
@@ -10189,7 +10560,47 @@
           <w:sz w:val="20"/>
           <w:szCs w:val="20"/>
         </w:rPr>
-        <w:t xml:space="preserve">Tabla 10. Capacidades declaradas fuera de alcance (Won't) o diferidas (Could). Fuente: elaboración propia. Las tres primeras filas quedan excluidas de esta gestión; las dos últimas: la notificación de alertas por correo y la exportación a Excel y PDF se declaran diferidas: no </w:t>
+        <w:t>Tabla 10. Capacidades declaradas fuera de alcance (</w:t>
+      </w:r>
+      <w:proofErr w:type="spellStart"/>
+      <w:r>
+        <w:rPr>
+          <w:i/>
+          <w:iCs/>
+          <w:sz w:val="20"/>
+          <w:szCs w:val="20"/>
+        </w:rPr>
+        <w:t>Won't</w:t>
+      </w:r>
+      <w:proofErr w:type="spellEnd"/>
+      <w:r>
+        <w:rPr>
+          <w:i/>
+          <w:iCs/>
+          <w:sz w:val="20"/>
+          <w:szCs w:val="20"/>
+        </w:rPr>
+        <w:t>) o diferidas (</w:t>
+      </w:r>
+      <w:proofErr w:type="spellStart"/>
+      <w:r>
+        <w:rPr>
+          <w:i/>
+          <w:iCs/>
+          <w:sz w:val="20"/>
+          <w:szCs w:val="20"/>
+        </w:rPr>
+        <w:t>Could</w:t>
+      </w:r>
+      <w:proofErr w:type="spellEnd"/>
+      <w:r>
+        <w:rPr>
+          <w:i/>
+          <w:iCs/>
+          <w:sz w:val="20"/>
+          <w:szCs w:val="20"/>
+        </w:rPr>
+        <w:t xml:space="preserve">). Fuente: elaboración propia. Las tres primeras filas quedan excluidas de esta gestión; las dos últimas: la notificación de alertas por correo y la exportación a Excel y PDF se declaran diferidas: no </w:t>
       </w:r>
       <w:r>
         <w:rPr>
@@ -10218,7 +10629,7 @@
         <mc:AlternateContent>
           <mc:Choice Requires="wpg">
             <w:drawing>
-              <wp:anchor distT="0" distB="0" distL="114300" distR="114300" simplePos="0" relativeHeight="251663360" behindDoc="1" locked="0" layoutInCell="1" allowOverlap="1" wp14:anchorId="6E9FC8DC" wp14:editId="1ABA65E7">
+              <wp:anchor distT="0" distB="0" distL="114300" distR="114300" simplePos="0" relativeHeight="251663360" behindDoc="1" locked="0" layoutInCell="1" allowOverlap="1" wp14:anchorId="6E9FC8DC" wp14:editId="758B8ED7">
                 <wp:simplePos x="0" y="0"/>
                 <wp:positionH relativeFrom="margin">
                   <wp:posOffset>-82648</wp:posOffset>
@@ -11131,8 +11542,13 @@
               <w:spacing w:before="60" w:after="0"/>
             </w:pPr>
             <w:r>
-              <w:t>Servicio de la API · Firebase Authentication</w:t>
-            </w:r>
+              <w:t xml:space="preserve">Servicio de la API · Firebase </w:t>
+            </w:r>
+            <w:proofErr w:type="spellStart"/>
+            <w:r>
+              <w:t>Authentication</w:t>
+            </w:r>
+            <w:proofErr w:type="spellEnd"/>
           </w:p>
         </w:tc>
         <w:tc>
@@ -11216,9 +11632,14 @@
             <w:pPr>
               <w:spacing w:before="60" w:after="0"/>
             </w:pPr>
+            <w:proofErr w:type="spellStart"/>
             <w:r>
               <w:lastRenderedPageBreak/>
-              <w:t>FastAPI sobre Python 3.13</w:t>
+              <w:t>FastAPI</w:t>
+            </w:r>
+            <w:proofErr w:type="spellEnd"/>
+            <w:r>
+              <w:t xml:space="preserve"> sobre Python 3.13</w:t>
             </w:r>
           </w:p>
         </w:tc>
@@ -11242,7 +11663,15 @@
             </w:r>
             <w:r>
               <w:lastRenderedPageBreak/>
-              <w:t>Firebase Authentication · módulo de adquisición</w:t>
+              <w:t xml:space="preserve">Firebase </w:t>
+            </w:r>
+            <w:proofErr w:type="spellStart"/>
+            <w:r>
+              <w:t>Authentication</w:t>
+            </w:r>
+            <w:proofErr w:type="spellEnd"/>
+            <w:r>
+              <w:t xml:space="preserve"> · módulo de adquisición</w:t>
             </w:r>
           </w:p>
         </w:tc>
@@ -11364,8 +11793,13 @@
             <w:pPr>
               <w:spacing w:before="60" w:after="0"/>
             </w:pPr>
-            <w:r>
-              <w:t>gRPC / HTTPS</w:t>
+            <w:proofErr w:type="spellStart"/>
+            <w:r>
+              <w:t>gRPC</w:t>
+            </w:r>
+            <w:proofErr w:type="spellEnd"/>
+            <w:r>
+              <w:t xml:space="preserve"> / HTTPS</w:t>
             </w:r>
           </w:p>
         </w:tc>
@@ -11427,8 +11861,13 @@
               <w:spacing w:before="60" w:after="0"/>
             </w:pPr>
             <w:r>
-              <w:t>Firebase Authentication</w:t>
-            </w:r>
+              <w:t xml:space="preserve">Firebase </w:t>
+            </w:r>
+            <w:proofErr w:type="spellStart"/>
+            <w:r>
+              <w:t>Authentication</w:t>
+            </w:r>
+            <w:proofErr w:type="spellEnd"/>
           </w:p>
         </w:tc>
         <w:tc>
@@ -12016,9 +12455,11 @@
             <w:pPr>
               <w:spacing w:after="0"/>
             </w:pPr>
+            <w:proofErr w:type="spellStart"/>
             <w:r>
               <w:t>modulo_id</w:t>
             </w:r>
+            <w:proofErr w:type="spellEnd"/>
           </w:p>
         </w:tc>
         <w:tc>
@@ -12099,8 +12540,13 @@
               <w:spacing w:after="0"/>
             </w:pPr>
             <w:r>
-              <w:t>Referencia a modulos_cultivo</w:t>
-            </w:r>
+              <w:t xml:space="preserve">Referencia a </w:t>
+            </w:r>
+            <w:proofErr w:type="spellStart"/>
+            <w:r>
+              <w:t>modulos_cultivo</w:t>
+            </w:r>
+            <w:proofErr w:type="spellEnd"/>
           </w:p>
         </w:tc>
         <w:tc>
@@ -12247,7 +12693,47 @@
               <w:spacing w:after="0"/>
             </w:pPr>
             <w:r>
-              <w:t>Variable medida: ph, ec, tds, temp_solucion, temp_ambiental, humedad</w:t>
+              <w:t xml:space="preserve">Variable medida: </w:t>
+            </w:r>
+            <w:proofErr w:type="spellStart"/>
+            <w:r>
+              <w:t>ph</w:t>
+            </w:r>
+            <w:proofErr w:type="spellEnd"/>
+            <w:r>
+              <w:t xml:space="preserve">, </w:t>
+            </w:r>
+            <w:proofErr w:type="spellStart"/>
+            <w:r>
+              <w:t>ec</w:t>
+            </w:r>
+            <w:proofErr w:type="spellEnd"/>
+            <w:r>
+              <w:t xml:space="preserve">, </w:t>
+            </w:r>
+            <w:proofErr w:type="spellStart"/>
+            <w:r>
+              <w:t>tds</w:t>
+            </w:r>
+            <w:proofErr w:type="spellEnd"/>
+            <w:r>
+              <w:t xml:space="preserve">, </w:t>
+            </w:r>
+            <w:proofErr w:type="spellStart"/>
+            <w:r>
+              <w:t>temp_solucion</w:t>
+            </w:r>
+            <w:proofErr w:type="spellEnd"/>
+            <w:r>
+              <w:t xml:space="preserve">, </w:t>
+            </w:r>
+            <w:proofErr w:type="spellStart"/>
+            <w:r>
+              <w:t>temp_ambiental</w:t>
+            </w:r>
+            <w:proofErr w:type="spellEnd"/>
+            <w:r>
+              <w:t>, humedad</w:t>
             </w:r>
           </w:p>
         </w:tc>
@@ -12598,8 +13084,13 @@
             <w:pPr>
               <w:spacing w:after="0"/>
             </w:pPr>
-            <w:r>
-              <w:t>automatico o manual</w:t>
+            <w:proofErr w:type="spellStart"/>
+            <w:r>
+              <w:t>automatico</w:t>
+            </w:r>
+            <w:proofErr w:type="spellEnd"/>
+            <w:r>
+              <w:t xml:space="preserve"> o manual</w:t>
             </w:r>
           </w:p>
         </w:tc>
@@ -12630,9 +13121,11 @@
             <w:tcW w:w="1413" w:type="dxa"/>
           </w:tcPr>
           <w:p>
+            <w:proofErr w:type="spellStart"/>
             <w:r>
               <w:t>registrado_por</w:t>
             </w:r>
+            <w:proofErr w:type="spellEnd"/>
           </w:p>
         </w:tc>
         <w:tc>
@@ -12687,7 +13180,15 @@
           </w:tcPr>
           <w:p>
             <w:r>
-              <w:t xml:space="preserve">El campo registrado_por guarda el identificador del usuario que realizó la medición manual; </w:t>
+              <w:t xml:space="preserve">El campo </w:t>
+            </w:r>
+            <w:proofErr w:type="spellStart"/>
+            <w:r>
+              <w:t>registrado_por</w:t>
+            </w:r>
+            <w:proofErr w:type="spellEnd"/>
+            <w:r>
+              <w:t xml:space="preserve"> guarda el identificador del usuario que realizó la medición manual; </w:t>
             </w:r>
             <w:r>
               <w:lastRenderedPageBreak/>
@@ -12712,10 +13213,12 @@
             <w:pPr>
               <w:spacing w:after="0"/>
             </w:pPr>
+            <w:proofErr w:type="spellStart"/>
             <w:r>
               <w:lastRenderedPageBreak/>
               <w:t>timestamp</w:t>
             </w:r>
+            <w:proofErr w:type="spellEnd"/>
           </w:p>
         </w:tc>
         <w:tc>
@@ -12837,9 +13340,11 @@
             <w:pPr>
               <w:spacing w:after="0"/>
             </w:pPr>
+            <w:proofErr w:type="spellStart"/>
             <w:r>
               <w:t>estado_rango</w:t>
             </w:r>
+            <w:proofErr w:type="spellEnd"/>
           </w:p>
         </w:tc>
         <w:tc>
@@ -12920,8 +13425,13 @@
               <w:spacing w:after="0"/>
             </w:pPr>
             <w:r>
-              <w:t>dentro, bajo, alto o sin_rango</w:t>
-            </w:r>
+              <w:t xml:space="preserve">dentro, bajo, alto o </w:t>
+            </w:r>
+            <w:proofErr w:type="spellStart"/>
+            <w:r>
+              <w:t>sin_rango</w:t>
+            </w:r>
+            <w:proofErr w:type="spellEnd"/>
           </w:p>
         </w:tc>
         <w:tc>
@@ -12961,9 +13471,11 @@
             <w:pPr>
               <w:spacing w:after="0"/>
             </w:pPr>
+            <w:proofErr w:type="spellStart"/>
             <w:r>
               <w:t>observacion</w:t>
             </w:r>
+            <w:proofErr w:type="spellEnd"/>
           </w:p>
         </w:tc>
         <w:tc>
@@ -13102,8 +13614,17 @@
           <w:b/>
           <w:bCs/>
         </w:rPr>
-        <w:t>Diccionario de datos — colección modulos_cultivo</w:t>
-      </w:r>
+        <w:t xml:space="preserve">Diccionario de datos — colección </w:t>
+      </w:r>
+      <w:proofErr w:type="spellStart"/>
+      <w:r>
+        <w:rPr>
+          <w:b/>
+          <w:bCs/>
+        </w:rPr>
+        <w:t>modulos_cultivo</w:t>
+      </w:r>
+      <w:proofErr w:type="spellEnd"/>
     </w:p>
     <w:tbl>
       <w:tblPr>
@@ -13429,9 +13950,11 @@
             <w:pPr>
               <w:spacing w:after="0"/>
             </w:pPr>
+            <w:proofErr w:type="spellStart"/>
             <w:r>
               <w:t>tipo_cultivo</w:t>
             </w:r>
+            <w:proofErr w:type="spellEnd"/>
           </w:p>
         </w:tc>
         <w:tc>
@@ -13517,9 +14040,11 @@
             <w:pPr>
               <w:spacing w:after="0"/>
             </w:pPr>
+            <w:proofErr w:type="spellStart"/>
             <w:r>
               <w:t>perfil_id</w:t>
             </w:r>
+            <w:proofErr w:type="spellEnd"/>
           </w:p>
         </w:tc>
         <w:tc>
@@ -13576,8 +14101,13 @@
               <w:spacing w:after="0"/>
             </w:pPr>
             <w:r>
-              <w:t>Referencia a perfiles_cultivo</w:t>
-            </w:r>
+              <w:t xml:space="preserve">Referencia a </w:t>
+            </w:r>
+            <w:proofErr w:type="spellStart"/>
+            <w:r>
+              <w:t>perfiles_cultivo</w:t>
+            </w:r>
+            <w:proofErr w:type="spellEnd"/>
           </w:p>
         </w:tc>
         <w:tc>
@@ -13605,9 +14135,11 @@
             <w:pPr>
               <w:spacing w:after="0"/>
             </w:pPr>
+            <w:proofErr w:type="spellStart"/>
             <w:r>
               <w:t>ubicacion</w:t>
             </w:r>
+            <w:proofErr w:type="spellEnd"/>
           </w:p>
         </w:tc>
         <w:tc>
@@ -13789,7 +14321,27 @@
           <w:sz w:val="20"/>
           <w:szCs w:val="20"/>
         </w:rPr>
-        <w:t>Tabla 13. Diccionario de datos de la colección modulos_cultivo. Identifica cada zona de cultivo y el perfil del que toma los rangos con que se evalúan sus lecturas. Fuente: elaboración propia.</w:t>
+        <w:t xml:space="preserve">Tabla 13. Diccionario de datos de la colección </w:t>
+      </w:r>
+      <w:proofErr w:type="spellStart"/>
+      <w:r>
+        <w:rPr>
+          <w:i/>
+          <w:iCs/>
+          <w:sz w:val="20"/>
+          <w:szCs w:val="20"/>
+        </w:rPr>
+        <w:t>modulos_cultivo</w:t>
+      </w:r>
+      <w:proofErr w:type="spellEnd"/>
+      <w:r>
+        <w:rPr>
+          <w:i/>
+          <w:iCs/>
+          <w:sz w:val="20"/>
+          <w:szCs w:val="20"/>
+        </w:rPr>
+        <w:t>. Identifica cada zona de cultivo y el perfil del que toma los rangos con que se evalúan sus lecturas. Fuente: elaboración propia.</w:t>
       </w:r>
     </w:p>
     <w:p>
@@ -13805,8 +14357,17 @@
           <w:bCs/>
         </w:rPr>
         <w:lastRenderedPageBreak/>
-        <w:t>Diccionario de datos — colección perfiles_cultivo</w:t>
-      </w:r>
+        <w:t xml:space="preserve">Diccionario de datos — colección </w:t>
+      </w:r>
+      <w:proofErr w:type="spellStart"/>
+      <w:r>
+        <w:rPr>
+          <w:b/>
+          <w:bCs/>
+        </w:rPr>
+        <w:t>perfiles_cultivo</w:t>
+      </w:r>
+      <w:proofErr w:type="spellEnd"/>
     </w:p>
     <w:tbl>
       <w:tblPr>
@@ -14102,9 +14663,11 @@
             <w:vAlign w:val="center"/>
           </w:tcPr>
           <w:p>
+            <w:proofErr w:type="spellStart"/>
             <w:r>
               <w:t>descripcion</w:t>
             </w:r>
+            <w:proofErr w:type="spellEnd"/>
           </w:p>
         </w:tc>
         <w:tc>
@@ -14262,7 +14825,27 @@
           <w:sz w:val="20"/>
           <w:szCs w:val="20"/>
         </w:rPr>
-        <w:t>Tabla 14. Diccionario de datos de la colección perfiles_cultivo. Reúne los rangos de referencia de un cultivo; cada módulo adopta uno. Fuente: elaboración propia.</w:t>
+        <w:t xml:space="preserve">Tabla 14. Diccionario de datos de la colección </w:t>
+      </w:r>
+      <w:proofErr w:type="spellStart"/>
+      <w:r>
+        <w:rPr>
+          <w:i/>
+          <w:iCs/>
+          <w:sz w:val="20"/>
+          <w:szCs w:val="20"/>
+        </w:rPr>
+        <w:t>perfiles_cultivo</w:t>
+      </w:r>
+      <w:proofErr w:type="spellEnd"/>
+      <w:r>
+        <w:rPr>
+          <w:i/>
+          <w:iCs/>
+          <w:sz w:val="20"/>
+          <w:szCs w:val="20"/>
+        </w:rPr>
+        <w:t>. Reúne los rangos de referencia de un cultivo; cada módulo adopta uno. Fuente: elaboración propia.</w:t>
       </w:r>
     </w:p>
     <w:p/>
@@ -14503,9 +15086,11 @@
             <w:vAlign w:val="center"/>
           </w:tcPr>
           <w:p>
+            <w:proofErr w:type="spellStart"/>
             <w:r>
               <w:t>perfil_id</w:t>
             </w:r>
+            <w:proofErr w:type="spellEnd"/>
           </w:p>
         </w:tc>
         <w:tc>
@@ -14554,8 +15139,13 @@
           </w:tcPr>
           <w:p>
             <w:r>
-              <w:t>Referencia a perfiles_cultivo</w:t>
-            </w:r>
+              <w:t xml:space="preserve">Referencia a </w:t>
+            </w:r>
+            <w:proofErr w:type="spellStart"/>
+            <w:r>
+              <w:t>perfiles_cultivo</w:t>
+            </w:r>
+            <w:proofErr w:type="spellEnd"/>
           </w:p>
         </w:tc>
         <w:tc>
@@ -14651,9 +15241,11 @@
             <w:vAlign w:val="center"/>
           </w:tcPr>
           <w:p>
+            <w:proofErr w:type="spellStart"/>
             <w:r>
               <w:t>minimo</w:t>
             </w:r>
+            <w:proofErr w:type="spellEnd"/>
           </w:p>
         </w:tc>
         <w:tc>
@@ -14735,9 +15327,11 @@
             <w:vAlign w:val="center"/>
           </w:tcPr>
           <w:p>
+            <w:proofErr w:type="spellStart"/>
             <w:r>
               <w:t>maximo</w:t>
             </w:r>
+            <w:proofErr w:type="spellEnd"/>
           </w:p>
         </w:tc>
         <w:tc>
@@ -14923,8 +15517,17 @@
           <w:bCs/>
         </w:rPr>
         <w:lastRenderedPageBreak/>
-        <w:t>Diccionario de datos — colección alertas</w:t>
-      </w:r>
+        <w:t xml:space="preserve">Diccionario de datos — </w:t>
+      </w:r>
+      <w:proofErr w:type="gramStart"/>
+      <w:r>
+        <w:rPr>
+          <w:b/>
+          <w:bCs/>
+        </w:rPr>
+        <w:t>colección alertas</w:t>
+      </w:r>
+      <w:proofErr w:type="gramEnd"/>
     </w:p>
     <w:tbl>
       <w:tblPr>
@@ -15145,9 +15748,11 @@
             <w:vAlign w:val="center"/>
           </w:tcPr>
           <w:p>
+            <w:proofErr w:type="spellStart"/>
             <w:r>
               <w:t>lectura_id</w:t>
             </w:r>
+            <w:proofErr w:type="spellEnd"/>
           </w:p>
         </w:tc>
         <w:tc>
@@ -15219,9 +15824,11 @@
             <w:vAlign w:val="center"/>
           </w:tcPr>
           <w:p>
+            <w:proofErr w:type="spellStart"/>
             <w:r>
               <w:t>modulo_id</w:t>
             </w:r>
+            <w:proofErr w:type="spellEnd"/>
           </w:p>
         </w:tc>
         <w:tc>
@@ -15270,8 +15877,13 @@
           </w:tcPr>
           <w:p>
             <w:r>
-              <w:t>Referencia a modulos_cultivo</w:t>
-            </w:r>
+              <w:t xml:space="preserve">Referencia a </w:t>
+            </w:r>
+            <w:proofErr w:type="spellStart"/>
+            <w:r>
+              <w:t>modulos_cultivo</w:t>
+            </w:r>
+            <w:proofErr w:type="spellEnd"/>
           </w:p>
         </w:tc>
         <w:tc>
@@ -15515,9 +16127,11 @@
             <w:vAlign w:val="center"/>
           </w:tcPr>
           <w:p>
+            <w:proofErr w:type="spellStart"/>
             <w:r>
               <w:t>rango_minimo</w:t>
             </w:r>
+            <w:proofErr w:type="spellEnd"/>
           </w:p>
         </w:tc>
         <w:tc>
@@ -15589,10 +16203,12 @@
             <w:vAlign w:val="center"/>
           </w:tcPr>
           <w:p>
+            <w:proofErr w:type="spellStart"/>
             <w:r>
               <w:lastRenderedPageBreak/>
               <w:t>rango_maximo</w:t>
             </w:r>
+            <w:proofErr w:type="spellEnd"/>
           </w:p>
         </w:tc>
         <w:tc>
@@ -15664,9 +16280,11 @@
             <w:vAlign w:val="center"/>
           </w:tcPr>
           <w:p>
+            <w:proofErr w:type="spellStart"/>
             <w:r>
               <w:t>desviacion</w:t>
             </w:r>
+            <w:proofErr w:type="spellEnd"/>
           </w:p>
         </w:tc>
         <w:tc>
@@ -15815,9 +16433,11 @@
             <w:vAlign w:val="center"/>
           </w:tcPr>
           <w:p>
+            <w:proofErr w:type="spellStart"/>
             <w:r>
               <w:t>timestamp</w:t>
             </w:r>
+            <w:proofErr w:type="spellEnd"/>
           </w:p>
         </w:tc>
         <w:tc>
@@ -15889,9 +16509,11 @@
             <w:vAlign w:val="center"/>
           </w:tcPr>
           <w:p>
+            <w:proofErr w:type="spellStart"/>
             <w:r>
               <w:t>observacion</w:t>
             </w:r>
+            <w:proofErr w:type="spellEnd"/>
           </w:p>
         </w:tc>
         <w:tc>
@@ -16194,7 +16816,15 @@
           </w:tcPr>
           <w:p>
             <w:r>
-              <w:t>Igual al uid del proveedor de identidad</w:t>
+              <w:t xml:space="preserve">Igual al </w:t>
+            </w:r>
+            <w:proofErr w:type="spellStart"/>
+            <w:r>
+              <w:t>uid</w:t>
+            </w:r>
+            <w:proofErr w:type="spellEnd"/>
+            <w:r>
+              <w:t xml:space="preserve"> del proveedor de identidad</w:t>
             </w:r>
           </w:p>
         </w:tc>
@@ -16205,8 +16835,13 @@
           </w:tcPr>
           <w:p>
             <w:r>
-              <w:t>Identificador de la cuenta, emitido por Firebase Authentication</w:t>
-            </w:r>
+              <w:t xml:space="preserve">Identificador de la cuenta, emitido por Firebase </w:t>
+            </w:r>
+            <w:proofErr w:type="spellStart"/>
+            <w:r>
+              <w:t>Authentication</w:t>
+            </w:r>
+            <w:proofErr w:type="spellEnd"/>
           </w:p>
         </w:tc>
       </w:tr>
@@ -16516,9 +17151,11 @@
             <w:vAlign w:val="center"/>
           </w:tcPr>
           <w:p>
+            <w:proofErr w:type="spellStart"/>
             <w:r>
               <w:t>telefono</w:t>
             </w:r>
+            <w:proofErr w:type="spellEnd"/>
           </w:p>
         </w:tc>
         <w:tc>
@@ -16680,7 +17317,27 @@
           <w:sz w:val="20"/>
           <w:szCs w:val="20"/>
         </w:rPr>
-        <w:t>Tabla 17. Diccionario de datos de la colección usuarios. Guarda el perfil de la cuenta. El identificador del documento es el mismo uid que emite el proveedor de identidad, de modo que la autorización resuelve el rol sin una consulta adicional por correo. Fuente: elaboración propia.</w:t>
+        <w:t xml:space="preserve">Tabla 17. Diccionario de datos de la colección usuarios. Guarda el perfil de la cuenta. El identificador del documento es el mismo </w:t>
+      </w:r>
+      <w:proofErr w:type="spellStart"/>
+      <w:r>
+        <w:rPr>
+          <w:i/>
+          <w:iCs/>
+          <w:sz w:val="20"/>
+          <w:szCs w:val="20"/>
+        </w:rPr>
+        <w:t>uid</w:t>
+      </w:r>
+      <w:proofErr w:type="spellEnd"/>
+      <w:r>
+        <w:rPr>
+          <w:i/>
+          <w:iCs/>
+          <w:sz w:val="20"/>
+          <w:szCs w:val="20"/>
+        </w:rPr>
+        <w:t xml:space="preserve"> que emite el proveedor de identidad, de modo que la autorización resuelve el rol sin una consulta adicional por correo. Fuente: elaboración propia.</w:t>
       </w:r>
     </w:p>
     <w:p>
@@ -16821,7 +17478,27 @@
           <w:sz w:val="20"/>
           <w:szCs w:val="20"/>
         </w:rPr>
-        <w:t>Figura 5. Wireframes de las pantallas principales. Fuente: elaboración propia.</w:t>
+        <w:t xml:space="preserve">Figura 5. </w:t>
+      </w:r>
+      <w:proofErr w:type="spellStart"/>
+      <w:r>
+        <w:rPr>
+          <w:i/>
+          <w:iCs/>
+          <w:sz w:val="20"/>
+          <w:szCs w:val="20"/>
+        </w:rPr>
+        <w:t>Wireframes</w:t>
+      </w:r>
+      <w:proofErr w:type="spellEnd"/>
+      <w:r>
+        <w:rPr>
+          <w:i/>
+          <w:iCs/>
+          <w:sz w:val="20"/>
+          <w:szCs w:val="20"/>
+        </w:rPr>
+        <w:t xml:space="preserve"> de las pantallas principales. Fuente: elaboración propia.</w:t>
       </w:r>
     </w:p>
     <w:p>
@@ -16948,6 +17625,7 @@
               <w:spacing w:before="120" w:after="0"/>
               <w:jc w:val="center"/>
             </w:pPr>
+            <w:proofErr w:type="spellStart"/>
             <w:r>
               <w:rPr>
                 <w:b/>
@@ -16955,6 +17633,7 @@
               </w:rPr>
               <w:t>Auth</w:t>
             </w:r>
+            <w:proofErr w:type="spellEnd"/>
           </w:p>
         </w:tc>
         <w:tc>
@@ -17304,8 +17983,13 @@
               <w:spacing w:after="0"/>
             </w:pPr>
             <w:r>
-              <w:t>variable, valor, unidad, timestamp</w:t>
-            </w:r>
+              <w:t xml:space="preserve">variable, valor, unidad, </w:t>
+            </w:r>
+            <w:proofErr w:type="spellStart"/>
+            <w:r>
+              <w:t>timestamp</w:t>
+            </w:r>
+            <w:proofErr w:type="spellEnd"/>
           </w:p>
         </w:tc>
         <w:tc>
@@ -17445,9 +18129,19 @@
             <w:pPr>
               <w:spacing w:after="0"/>
             </w:pPr>
-            <w:r>
-              <w:t>modulo_id, variable, valor, observacion</w:t>
-            </w:r>
+            <w:proofErr w:type="spellStart"/>
+            <w:r>
+              <w:t>modulo_id</w:t>
+            </w:r>
+            <w:proofErr w:type="spellEnd"/>
+            <w:r>
+              <w:t xml:space="preserve">, variable, valor, </w:t>
+            </w:r>
+            <w:proofErr w:type="spellStart"/>
+            <w:r>
+              <w:t>observacion</w:t>
+            </w:r>
+            <w:proofErr w:type="spellEnd"/>
           </w:p>
         </w:tc>
         <w:tc>
@@ -17587,8 +18281,13 @@
             <w:pPr>
               <w:spacing w:after="0"/>
             </w:pPr>
-            <w:r>
-              <w:t>modulo_id, variable, desde, hasta, limite</w:t>
+            <w:proofErr w:type="spellStart"/>
+            <w:r>
+              <w:t>modulo_id</w:t>
+            </w:r>
+            <w:proofErr w:type="spellEnd"/>
+            <w:r>
+              <w:t>, variable, desde, hasta, limite</w:t>
             </w:r>
           </w:p>
         </w:tc>
@@ -17821,7 +18520,23 @@
               <w:spacing w:after="0"/>
             </w:pPr>
             <w:r>
-              <w:t>/api/v1/modulos · /api/v1/modulos/{id}</w:t>
+              <w:t>/api/v1/</w:t>
+            </w:r>
+            <w:proofErr w:type="spellStart"/>
+            <w:r>
+              <w:t>modulos</w:t>
+            </w:r>
+            <w:proofErr w:type="spellEnd"/>
+            <w:r>
+              <w:t xml:space="preserve"> · /api/v1/</w:t>
+            </w:r>
+            <w:proofErr w:type="spellStart"/>
+            <w:r>
+              <w:t>modulos</w:t>
+            </w:r>
+            <w:proofErr w:type="spellEnd"/>
+            <w:r>
+              <w:t>/{id}</w:t>
             </w:r>
           </w:p>
         </w:tc>
@@ -17881,7 +18596,31 @@
               <w:spacing w:after="0"/>
             </w:pPr>
             <w:r>
-              <w:t>nombre, tipo_cultivo, perfil_id, ubicacion, activo</w:t>
+              <w:t xml:space="preserve">nombre, </w:t>
+            </w:r>
+            <w:proofErr w:type="spellStart"/>
+            <w:r>
+              <w:t>tipo_cultivo</w:t>
+            </w:r>
+            <w:proofErr w:type="spellEnd"/>
+            <w:r>
+              <w:t xml:space="preserve">, </w:t>
+            </w:r>
+            <w:proofErr w:type="spellStart"/>
+            <w:r>
+              <w:t>perfil_id</w:t>
+            </w:r>
+            <w:proofErr w:type="spellEnd"/>
+            <w:r>
+              <w:t xml:space="preserve">, </w:t>
+            </w:r>
+            <w:proofErr w:type="spellStart"/>
+            <w:r>
+              <w:t>ubicacion</w:t>
+            </w:r>
+            <w:proofErr w:type="spellEnd"/>
+            <w:r>
+              <w:t>, activo</w:t>
             </w:r>
           </w:p>
         </w:tc>
@@ -17978,7 +18717,15 @@
           </w:tcPr>
           <w:p>
             <w:r>
-              <w:t>nombre, descripcion, predefinido</w:t>
+              <w:t xml:space="preserve">nombre, </w:t>
+            </w:r>
+            <w:proofErr w:type="spellStart"/>
+            <w:r>
+              <w:t>descripcion</w:t>
+            </w:r>
+            <w:proofErr w:type="spellEnd"/>
+            <w:r>
+              <w:t>, predefinido</w:t>
             </w:r>
           </w:p>
         </w:tc>
@@ -18056,7 +18803,63 @@
               <w:rPr>
                 <w:lang w:val="en-US"/>
               </w:rPr>
-              <w:t>/api/v1/rangos · /api/v1/rangos/{id}</w:t>
+              <w:t>/</w:t>
+            </w:r>
+            <w:proofErr w:type="spellStart"/>
+            <w:r>
+              <w:rPr>
+                <w:lang w:val="en-US"/>
+              </w:rPr>
+              <w:t>api</w:t>
+            </w:r>
+            <w:proofErr w:type="spellEnd"/>
+            <w:r>
+              <w:rPr>
+                <w:lang w:val="en-US"/>
+              </w:rPr>
+              <w:t>/v1/</w:t>
+            </w:r>
+            <w:proofErr w:type="spellStart"/>
+            <w:r>
+              <w:rPr>
+                <w:lang w:val="en-US"/>
+              </w:rPr>
+              <w:t>rangos</w:t>
+            </w:r>
+            <w:proofErr w:type="spellEnd"/>
+            <w:r>
+              <w:rPr>
+                <w:lang w:val="en-US"/>
+              </w:rPr>
+              <w:t xml:space="preserve"> · /</w:t>
+            </w:r>
+            <w:proofErr w:type="spellStart"/>
+            <w:r>
+              <w:rPr>
+                <w:lang w:val="en-US"/>
+              </w:rPr>
+              <w:t>api</w:t>
+            </w:r>
+            <w:proofErr w:type="spellEnd"/>
+            <w:r>
+              <w:rPr>
+                <w:lang w:val="en-US"/>
+              </w:rPr>
+              <w:t>/v1/</w:t>
+            </w:r>
+            <w:proofErr w:type="spellStart"/>
+            <w:r>
+              <w:rPr>
+                <w:lang w:val="en-US"/>
+              </w:rPr>
+              <w:t>rangos</w:t>
+            </w:r>
+            <w:proofErr w:type="spellEnd"/>
+            <w:r>
+              <w:rPr>
+                <w:lang w:val="en-US"/>
+              </w:rPr>
+              <w:t>/{id}</w:t>
             </w:r>
           </w:p>
         </w:tc>
@@ -18115,9 +18918,27 @@
             <w:pPr>
               <w:spacing w:after="0"/>
             </w:pPr>
-            <w:r>
-              <w:t>perfil_id, variable, minimo, maximo</w:t>
-            </w:r>
+            <w:proofErr w:type="spellStart"/>
+            <w:r>
+              <w:t>perfil_id</w:t>
+            </w:r>
+            <w:proofErr w:type="spellEnd"/>
+            <w:r>
+              <w:t xml:space="preserve">, variable, </w:t>
+            </w:r>
+            <w:proofErr w:type="spellStart"/>
+            <w:r>
+              <w:t>minimo</w:t>
+            </w:r>
+            <w:proofErr w:type="spellEnd"/>
+            <w:r>
+              <w:t xml:space="preserve">, </w:t>
+            </w:r>
+            <w:proofErr w:type="spellStart"/>
+            <w:r>
+              <w:t>maximo</w:t>
+            </w:r>
+            <w:proofErr w:type="spellEnd"/>
           </w:p>
         </w:tc>
         <w:tc>
@@ -18263,8 +19084,21 @@
             </w:pPr>
             <w:r>
               <w:lastRenderedPageBreak/>
-              <w:t>estado, modulo_id, observacion</w:t>
-            </w:r>
+              <w:t xml:space="preserve">estado, </w:t>
+            </w:r>
+            <w:proofErr w:type="spellStart"/>
+            <w:r>
+              <w:t>modulo_id</w:t>
+            </w:r>
+            <w:proofErr w:type="spellEnd"/>
+            <w:r>
+              <w:t xml:space="preserve">, </w:t>
+            </w:r>
+            <w:proofErr w:type="spellStart"/>
+            <w:r>
+              <w:t>observacion</w:t>
+            </w:r>
+            <w:proofErr w:type="spellEnd"/>
           </w:p>
         </w:tc>
         <w:tc>
@@ -18405,7 +19239,15 @@
               <w:spacing w:after="0"/>
             </w:pPr>
             <w:r>
-              <w:t>nombre, telefono, cargo</w:t>
+              <w:t xml:space="preserve">nombre, </w:t>
+            </w:r>
+            <w:proofErr w:type="spellStart"/>
+            <w:r>
+              <w:t>telefono</w:t>
+            </w:r>
+            <w:proofErr w:type="spellEnd"/>
+            <w:r>
+              <w:t>, cargo</w:t>
             </w:r>
           </w:p>
         </w:tc>
@@ -18570,7 +19412,15 @@
           </w:tcPr>
           <w:p>
             <w:r>
-              <w:t>/api/v1/usuarios/{uid}</w:t>
+              <w:t>/api/v1/usuarios/{</w:t>
+            </w:r>
+            <w:proofErr w:type="spellStart"/>
+            <w:r>
+              <w:t>uid</w:t>
+            </w:r>
+            <w:proofErr w:type="spellEnd"/>
+            <w:r>
+              <w:t>}</w:t>
             </w:r>
           </w:p>
         </w:tc>
@@ -18603,7 +19453,15 @@
           </w:tcPr>
           <w:p>
             <w:r>
-              <w:t>nombre, telefono, cargo, rol, activo</w:t>
+              <w:t xml:space="preserve">nombre, </w:t>
+            </w:r>
+            <w:proofErr w:type="spellStart"/>
+            <w:r>
+              <w:t>telefono</w:t>
+            </w:r>
+            <w:proofErr w:type="spellEnd"/>
+            <w:r>
+              <w:t>, cargo, rol, activo</w:t>
             </w:r>
           </w:p>
         </w:tc>
@@ -18828,7 +19686,23 @@
           <w:szCs w:val="26"/>
         </w:rPr>
         <w:lastRenderedPageBreak/>
-        <w:t>2.5 Justificación del stack tecnológico</w:t>
+        <w:t xml:space="preserve">2.5 Justificación del </w:t>
+      </w:r>
+      <w:proofErr w:type="spellStart"/>
+      <w:r>
+        <w:rPr>
+          <w:sz w:val="26"/>
+          <w:szCs w:val="26"/>
+        </w:rPr>
+        <w:t>stack</w:t>
+      </w:r>
+      <w:proofErr w:type="spellEnd"/>
+      <w:r>
+        <w:rPr>
+          <w:sz w:val="26"/>
+          <w:szCs w:val="26"/>
+        </w:rPr>
+        <w:t xml:space="preserve"> tecnológico</w:t>
       </w:r>
       <w:bookmarkEnd w:id="27"/>
     </w:p>
@@ -18981,9 +19855,11 @@
             <w:pPr>
               <w:spacing w:after="0"/>
             </w:pPr>
+            <w:proofErr w:type="spellStart"/>
             <w:r>
               <w:t>Frontend</w:t>
             </w:r>
+            <w:proofErr w:type="spellEnd"/>
           </w:p>
         </w:tc>
         <w:tc>
@@ -19086,11 +19962,33 @@
                 <w:lang w:val="en-US"/>
               </w:rPr>
             </w:pPr>
+            <w:proofErr w:type="spellStart"/>
             <w:r>
               <w:rPr>
                 <w:lang w:val="en-US"/>
               </w:rPr>
-              <w:t>FastAPI 0.141.1 · Python 3.13 · uvicorn 0.52.4 · firebase-admin 7.5.0</w:t>
+              <w:t>FastAPI</w:t>
+            </w:r>
+            <w:proofErr w:type="spellEnd"/>
+            <w:r>
+              <w:rPr>
+                <w:lang w:val="en-US"/>
+              </w:rPr>
+              <w:t xml:space="preserve"> 0.141.1 · Python 3.13 · </w:t>
+            </w:r>
+            <w:proofErr w:type="spellStart"/>
+            <w:r>
+              <w:rPr>
+                <w:lang w:val="en-US"/>
+              </w:rPr>
+              <w:t>uvicorn</w:t>
+            </w:r>
+            <w:proofErr w:type="spellEnd"/>
+            <w:r>
+              <w:rPr>
+                <w:lang w:val="en-US"/>
+              </w:rPr>
+              <w:t xml:space="preserve"> 0.52.4 · firebase-admin 7.5.0</w:t>
             </w:r>
           </w:p>
         </w:tc>
@@ -19130,7 +20028,15 @@
               <w:spacing w:after="0"/>
             </w:pPr>
             <w:r>
-              <w:t>RNF-07 (mantenibilidad): validación declarativa de los datos, contrato documentado con OpenAPI desde el propio código y módulos con responsabilidad separada</w:t>
+              <w:t xml:space="preserve">RNF-07 (mantenibilidad): validación declarativa de los datos, contrato documentado con </w:t>
+            </w:r>
+            <w:proofErr w:type="spellStart"/>
+            <w:r>
+              <w:t>OpenAPI</w:t>
+            </w:r>
+            <w:proofErr w:type="spellEnd"/>
+            <w:r>
+              <w:t xml:space="preserve"> desde el propio código y módulos con responsabilidad separada</w:t>
             </w:r>
           </w:p>
         </w:tc>
@@ -19254,8 +20160,13 @@
               <w:spacing w:after="0"/>
             </w:pPr>
             <w:r>
-              <w:t>Firebase Authentication</w:t>
-            </w:r>
+              <w:t xml:space="preserve">Firebase </w:t>
+            </w:r>
+            <w:proofErr w:type="spellStart"/>
+            <w:r>
+              <w:t>Authentication</w:t>
+            </w:r>
+            <w:proofErr w:type="spellEnd"/>
           </w:p>
         </w:tc>
         <w:tc>
@@ -19501,7 +20412,23 @@
               <w:spacing w:after="0"/>
             </w:pPr>
             <w:r>
-              <w:t>Open-Meteo (API pública) · http 1.6.0 · geolocator 14.0.3 (contexto complementario, fuera del alcance evaluado)</w:t>
+              <w:t>Open-</w:t>
+            </w:r>
+            <w:proofErr w:type="spellStart"/>
+            <w:r>
+              <w:t>Meteo</w:t>
+            </w:r>
+            <w:proofErr w:type="spellEnd"/>
+            <w:r>
+              <w:t xml:space="preserve"> (API pública) · http 1.6.0 · </w:t>
+            </w:r>
+            <w:proofErr w:type="spellStart"/>
+            <w:r>
+              <w:t>geolocator</w:t>
+            </w:r>
+            <w:proofErr w:type="spellEnd"/>
+            <w:r>
+              <w:t xml:space="preserve"> 14.0.3 (contexto complementario, fuera del alcance evaluado)</w:t>
             </w:r>
           </w:p>
         </w:tc>
@@ -19558,7 +20485,27 @@
           <w:sz w:val="20"/>
           <w:szCs w:val="20"/>
         </w:rPr>
-        <w:t>Tabla 19. Stack tecnológico y criterios de selección. Fuente: elaboración propia.</w:t>
+        <w:t xml:space="preserve">Tabla 19. </w:t>
+      </w:r>
+      <w:proofErr w:type="spellStart"/>
+      <w:r>
+        <w:rPr>
+          <w:i/>
+          <w:iCs/>
+          <w:sz w:val="20"/>
+          <w:szCs w:val="20"/>
+        </w:rPr>
+        <w:t>Stack</w:t>
+      </w:r>
+      <w:proofErr w:type="spellEnd"/>
+      <w:r>
+        <w:rPr>
+          <w:i/>
+          <w:iCs/>
+          <w:sz w:val="20"/>
+          <w:szCs w:val="20"/>
+        </w:rPr>
+        <w:t xml:space="preserve"> tecnológico y criterios de selección. Fuente: elaboración propia.</w:t>
       </w:r>
     </w:p>
     <w:p>
@@ -19675,14 +20622,70 @@
         <w:rPr>
           <w:bCs/>
         </w:rPr>
-        <w:t xml:space="preserve">Es el componente que cierra el sistema por el extremo del dato: un firmware propio, escrito sobre el marco de trabajo ESP-IDF de Espressif, que lee los sensores instalados en el módulo de cultivo y publica cada variable en el servicio por HTTPS, autenticándose con la clave propia del dispositivo. Mide de forma automática las seis variables: temperatura ambiental, humedad relativa, temperatura de la solución nutritiva, sólidos disueltos totales, conductividad eléctrica derivada y pH, con un ciclo de publicación de cinco minutos. La variable de pH se incorporó al cierre de la tercera iteración: el electrodo se recuperó con el remojo en solución de conservación, su señal atraviesa un divisor de tensión ÷2 antes de la entrada analógica del </w:t>
-      </w:r>
+        <w:t xml:space="preserve">Es el componente que cierra el sistema por el extremo del dato: un firmware propio, escrito sobre el marco de trabajo ESP-IDF de </w:t>
+      </w:r>
+      <w:proofErr w:type="spellStart"/>
       <w:r>
         <w:rPr>
           <w:bCs/>
         </w:rPr>
+        <w:t>Espressif</w:t>
+      </w:r>
+      <w:proofErr w:type="spellEnd"/>
+      <w:r>
+        <w:rPr>
+          <w:bCs/>
+        </w:rPr>
+        <w:t xml:space="preserve">, que lee los sensores instalados en el módulo de cultivo y publica cada variable en el servicio por HTTPS, autenticándose con la clave propia del dispositivo. Mide de forma automática las seis variables: temperatura ambiental, humedad relativa, temperatura de la solución nutritiva, sólidos disueltos totales, conductividad eléctrica derivada y pH, con un ciclo de publicación de cinco minutos. La variable de pH se incorporó al cierre de la tercera iteración: el electrodo se recuperó con el remojo en solución de conservación, su señal atraviesa un divisor de tensión ÷2 antes de la entrada analógica del </w:t>
+      </w:r>
+      <w:r>
+        <w:rPr>
+          <w:bCs/>
+        </w:rPr>
         <w:lastRenderedPageBreak/>
-        <w:t>microcontrolador y la conversión se calibró con los patrones de 4,01 y 6,86, que dieron 1520 mV y 1280 mV, esto es, 84,2 mV por unidad de pH.</w:t>
+        <w:t xml:space="preserve">microcontrolador y la conversión se calibró con los patrones de 4,01 y 6,86, que dieron 1520 </w:t>
+      </w:r>
+      <w:proofErr w:type="spellStart"/>
+      <w:r>
+        <w:rPr>
+          <w:bCs/>
+        </w:rPr>
+        <w:t>mV</w:t>
+      </w:r>
+      <w:proofErr w:type="spellEnd"/>
+      <w:r>
+        <w:rPr>
+          <w:bCs/>
+        </w:rPr>
+        <w:t xml:space="preserve"> y 1280 </w:t>
+      </w:r>
+      <w:proofErr w:type="spellStart"/>
+      <w:r>
+        <w:rPr>
+          <w:bCs/>
+        </w:rPr>
+        <w:t>mV</w:t>
+      </w:r>
+      <w:proofErr w:type="spellEnd"/>
+      <w:r>
+        <w:rPr>
+          <w:bCs/>
+        </w:rPr>
+        <w:t xml:space="preserve">, esto es, 84,2 </w:t>
+      </w:r>
+      <w:proofErr w:type="spellStart"/>
+      <w:r>
+        <w:rPr>
+          <w:bCs/>
+        </w:rPr>
+        <w:t>mV</w:t>
+      </w:r>
+      <w:proofErr w:type="spellEnd"/>
+      <w:r>
+        <w:rPr>
+          <w:bCs/>
+        </w:rPr>
+        <w:t xml:space="preserve"> por unidad de pH.</w:t>
       </w:r>
     </w:p>
     <w:p>
@@ -19704,7 +20707,15 @@
         <w:t xml:space="preserve">La calibración de fábrica del convertidor analógico. </w:t>
       </w:r>
       <w:r>
-        <w:t>El chip almacena en su memoria de configuración los valores de referencia con los que el fabricante caracterizó el convertidor; el firmware los recupera y los aplica, de modo que la tensión que informa es la medida y no una estimación por regla de tres. La diferencia es observable: con la estimación lineal el instrumento no distinguía su propio cero, que la calibración sitúa en 142 mV.</w:t>
+        <w:t xml:space="preserve">El chip almacena en su memoria de configuración los valores de referencia con los que el fabricante caracterizó el convertidor; el firmware los recupera y los aplica, de modo que la tensión que informa es la medida y no una estimación por regla de tres. La diferencia es observable: con la estimación lineal el instrumento no distinguía su propio cero, que la calibración sitúa en 142 </w:t>
+      </w:r>
+      <w:proofErr w:type="spellStart"/>
+      <w:r>
+        <w:t>mV</w:t>
+      </w:r>
+      <w:proofErr w:type="spellEnd"/>
+      <w:r>
+        <w:t>.</w:t>
       </w:r>
     </w:p>
     <w:p>
@@ -19746,7 +20757,23 @@
         <w:jc w:val="both"/>
       </w:pPr>
       <w:r>
-        <w:t xml:space="preserve">Los cuatro sensores del montaje actual se verificaron con ensayos propios, cuyos registros se conservan en el repositorio: el sensor de ambiente respondió de forma estable en su pin; la sonda de temperatura de la solución se contrastó contra el sensor de ambiente y ambos coincidieron dentro de 0,01 °C; y la respuesta del sensor de sólidos disueltos se comprobó por el método que indica su fabricante, con un incremento de 155 mV a 2 415 mV al alterar la concentración de la solución. La verificación de la compensación por temperatura arrojó una diferencia de 7,7 % frente a asumir la temperatura de </w:t>
+        <w:t xml:space="preserve">Los cuatro sensores del montaje actual se verificaron con ensayos propios, cuyos registros se conservan en el repositorio: el sensor de ambiente respondió de forma estable en su pin; la sonda de temperatura de la solución se contrastó contra el sensor de ambiente y ambos coincidieron dentro de 0,01 °C; y la respuesta del sensor de sólidos disueltos se comprobó por el método que indica su fabricante, con un incremento de 155 </w:t>
+      </w:r>
+      <w:proofErr w:type="spellStart"/>
+      <w:r>
+        <w:t>mV</w:t>
+      </w:r>
+      <w:proofErr w:type="spellEnd"/>
+      <w:r>
+        <w:t xml:space="preserve"> a 2 415 </w:t>
+      </w:r>
+      <w:proofErr w:type="spellStart"/>
+      <w:r>
+        <w:t>mV</w:t>
+      </w:r>
+      <w:proofErr w:type="spellEnd"/>
+      <w:r>
+        <w:t xml:space="preserve"> al alterar la concentración de la solución. La verificación de la compensación por temperatura arrojó una diferencia de 7,7 % frente a asumir la temperatura de </w:t>
       </w:r>
       <w:r>
         <w:lastRenderedPageBreak/>
@@ -19969,18 +20996,171 @@
       </w:r>
     </w:p>
     <w:p>
+      <w:proofErr w:type="spellStart"/>
       <w:r>
         <w:rPr>
           <w:rFonts w:ascii="Consolas" w:hAnsi="Consolas"/>
           <w:sz w:val="20"/>
         </w:rPr>
-        <w:t>def evaluar_lectura(valor: float, minimo: float | None, maximo: float | None) -&gt; str:</w:t>
-      </w:r>
+        <w:t>def</w:t>
+      </w:r>
+      <w:proofErr w:type="spellEnd"/>
       <w:r>
         <w:rPr>
           <w:rFonts w:ascii="Consolas" w:hAnsi="Consolas"/>
           <w:sz w:val="20"/>
         </w:rPr>
+        <w:t xml:space="preserve"> </w:t>
+      </w:r>
+      <w:proofErr w:type="spellStart"/>
+      <w:r>
+        <w:rPr>
+          <w:rFonts w:ascii="Consolas" w:hAnsi="Consolas"/>
+          <w:sz w:val="20"/>
+        </w:rPr>
+        <w:t>evaluar_lectura</w:t>
+      </w:r>
+      <w:proofErr w:type="spellEnd"/>
+      <w:r>
+        <w:rPr>
+          <w:rFonts w:ascii="Consolas" w:hAnsi="Consolas"/>
+          <w:sz w:val="20"/>
+        </w:rPr>
+        <w:t xml:space="preserve">(valor: </w:t>
+      </w:r>
+      <w:proofErr w:type="spellStart"/>
+      <w:r>
+        <w:rPr>
+          <w:rFonts w:ascii="Consolas" w:hAnsi="Consolas"/>
+          <w:sz w:val="20"/>
+        </w:rPr>
+        <w:t>float</w:t>
+      </w:r>
+      <w:proofErr w:type="spellEnd"/>
+      <w:r>
+        <w:rPr>
+          <w:rFonts w:ascii="Consolas" w:hAnsi="Consolas"/>
+          <w:sz w:val="20"/>
+        </w:rPr>
+        <w:t xml:space="preserve">, </w:t>
+      </w:r>
+      <w:proofErr w:type="spellStart"/>
+      <w:r>
+        <w:rPr>
+          <w:rFonts w:ascii="Consolas" w:hAnsi="Consolas"/>
+          <w:sz w:val="20"/>
+        </w:rPr>
+        <w:t>minimo</w:t>
+      </w:r>
+      <w:proofErr w:type="spellEnd"/>
+      <w:r>
+        <w:rPr>
+          <w:rFonts w:ascii="Consolas" w:hAnsi="Consolas"/>
+          <w:sz w:val="20"/>
+        </w:rPr>
+        <w:t xml:space="preserve">: </w:t>
+      </w:r>
+      <w:proofErr w:type="spellStart"/>
+      <w:r>
+        <w:rPr>
+          <w:rFonts w:ascii="Consolas" w:hAnsi="Consolas"/>
+          <w:sz w:val="20"/>
+        </w:rPr>
+        <w:t>float</w:t>
+      </w:r>
+      <w:proofErr w:type="spellEnd"/>
+      <w:r>
+        <w:rPr>
+          <w:rFonts w:ascii="Consolas" w:hAnsi="Consolas"/>
+          <w:sz w:val="20"/>
+        </w:rPr>
+        <w:t xml:space="preserve"> | </w:t>
+      </w:r>
+      <w:proofErr w:type="spellStart"/>
+      <w:r>
+        <w:rPr>
+          <w:rFonts w:ascii="Consolas" w:hAnsi="Consolas"/>
+          <w:sz w:val="20"/>
+        </w:rPr>
+        <w:t>None</w:t>
+      </w:r>
+      <w:proofErr w:type="spellEnd"/>
+      <w:r>
+        <w:rPr>
+          <w:rFonts w:ascii="Consolas" w:hAnsi="Consolas"/>
+          <w:sz w:val="20"/>
+        </w:rPr>
+        <w:t xml:space="preserve">, </w:t>
+      </w:r>
+      <w:proofErr w:type="spellStart"/>
+      <w:r>
+        <w:rPr>
+          <w:rFonts w:ascii="Consolas" w:hAnsi="Consolas"/>
+          <w:sz w:val="20"/>
+        </w:rPr>
+        <w:t>maximo</w:t>
+      </w:r>
+      <w:proofErr w:type="spellEnd"/>
+      <w:r>
+        <w:rPr>
+          <w:rFonts w:ascii="Consolas" w:hAnsi="Consolas"/>
+          <w:sz w:val="20"/>
+        </w:rPr>
+        <w:t xml:space="preserve">: </w:t>
+      </w:r>
+      <w:proofErr w:type="spellStart"/>
+      <w:r>
+        <w:rPr>
+          <w:rFonts w:ascii="Consolas" w:hAnsi="Consolas"/>
+          <w:sz w:val="20"/>
+        </w:rPr>
+        <w:t>float</w:t>
+      </w:r>
+      <w:proofErr w:type="spellEnd"/>
+      <w:r>
+        <w:rPr>
+          <w:rFonts w:ascii="Consolas" w:hAnsi="Consolas"/>
+          <w:sz w:val="20"/>
+        </w:rPr>
+        <w:t xml:space="preserve"> | </w:t>
+      </w:r>
+      <w:proofErr w:type="spellStart"/>
+      <w:r>
+        <w:rPr>
+          <w:rFonts w:ascii="Consolas" w:hAnsi="Consolas"/>
+          <w:sz w:val="20"/>
+        </w:rPr>
+        <w:t>None</w:t>
+      </w:r>
+      <w:proofErr w:type="spellEnd"/>
+      <w:r>
+        <w:rPr>
+          <w:rFonts w:ascii="Consolas" w:hAnsi="Consolas"/>
+          <w:sz w:val="20"/>
+        </w:rPr>
+        <w:t xml:space="preserve">) -&gt; </w:t>
+      </w:r>
+      <w:proofErr w:type="spellStart"/>
+      <w:r>
+        <w:rPr>
+          <w:rFonts w:ascii="Consolas" w:hAnsi="Consolas"/>
+          <w:sz w:val="20"/>
+        </w:rPr>
+        <w:t>str</w:t>
+      </w:r>
+      <w:proofErr w:type="spellEnd"/>
+      <w:r>
+        <w:rPr>
+          <w:rFonts w:ascii="Consolas" w:hAnsi="Consolas"/>
+          <w:sz w:val="20"/>
+        </w:rPr>
+        <w:t>:</w:t>
+      </w:r>
+      <w:r>
+        <w:rPr>
+          <w:rFonts w:ascii="Consolas" w:hAnsi="Consolas"/>
+          <w:sz w:val="20"/>
+        </w:rPr>
         <w:br/>
         <w:t xml:space="preserve">    """Devuelve el estado de una lectura respecto de su rango de referencia.</w:t>
       </w:r>
@@ -19990,13 +21170,29 @@
           <w:sz w:val="20"/>
         </w:rPr>
         <w:br/>
-        <w:t xml:space="preserve">    Si no hay rango configurado para la variable, el estado es sin_rango:</w:t>
-      </w:r>
+        <w:t xml:space="preserve">    Si no hay rango configurado para la variable, el estado es </w:t>
+      </w:r>
+      <w:proofErr w:type="spellStart"/>
       <w:r>
         <w:rPr>
           <w:rFonts w:ascii="Consolas" w:hAnsi="Consolas"/>
           <w:sz w:val="20"/>
         </w:rPr>
+        <w:t>sin_rango</w:t>
+      </w:r>
+      <w:proofErr w:type="spellEnd"/>
+      <w:r>
+        <w:rPr>
+          <w:rFonts w:ascii="Consolas" w:hAnsi="Consolas"/>
+          <w:sz w:val="20"/>
+        </w:rPr>
+        <w:t>:</w:t>
+      </w:r>
+      <w:r>
+        <w:rPr>
+          <w:rFonts w:ascii="Consolas" w:hAnsi="Consolas"/>
+          <w:sz w:val="20"/>
+        </w:rPr>
         <w:br/>
         <w:t xml:space="preserve">    la ausencia de referencia no es un valor fuera de rango.</w:t>
       </w:r>
@@ -20014,55 +21210,311 @@
           <w:sz w:val="20"/>
         </w:rPr>
         <w:br/>
-        <w:t xml:space="preserve">    if minimo is None or maximo is None:</w:t>
-      </w:r>
+        <w:t xml:space="preserve">    </w:t>
+      </w:r>
+      <w:proofErr w:type="spellStart"/>
       <w:r>
         <w:rPr>
           <w:rFonts w:ascii="Consolas" w:hAnsi="Consolas"/>
           <w:sz w:val="20"/>
         </w:rPr>
-        <w:br/>
-        <w:t xml:space="preserve">        return ESTADO_SIN_RANGO</w:t>
-      </w:r>
+        <w:t>if</w:t>
+      </w:r>
+      <w:proofErr w:type="spellEnd"/>
       <w:r>
         <w:rPr>
           <w:rFonts w:ascii="Consolas" w:hAnsi="Consolas"/>
           <w:sz w:val="20"/>
         </w:rPr>
-        <w:br/>
-        <w:t xml:space="preserve">    if valor &lt; minimo:</w:t>
-      </w:r>
+        <w:t xml:space="preserve"> </w:t>
+      </w:r>
+      <w:proofErr w:type="spellStart"/>
       <w:r>
         <w:rPr>
           <w:rFonts w:ascii="Consolas" w:hAnsi="Consolas"/>
           <w:sz w:val="20"/>
         </w:rPr>
-        <w:br/>
-        <w:t xml:space="preserve">        return ESTADO_BAJO</w:t>
-      </w:r>
+        <w:t>minimo</w:t>
+      </w:r>
+      <w:proofErr w:type="spellEnd"/>
       <w:r>
         <w:rPr>
           <w:rFonts w:ascii="Consolas" w:hAnsi="Consolas"/>
           <w:sz w:val="20"/>
         </w:rPr>
-        <w:br/>
-        <w:t xml:space="preserve">    if valor &gt; maximo:</w:t>
-      </w:r>
+        <w:t xml:space="preserve"> </w:t>
+      </w:r>
+      <w:proofErr w:type="spellStart"/>
       <w:r>
         <w:rPr>
           <w:rFonts w:ascii="Consolas" w:hAnsi="Consolas"/>
           <w:sz w:val="20"/>
         </w:rPr>
-        <w:br/>
-        <w:t xml:space="preserve">        return ESTADO_ALTO</w:t>
-      </w:r>
+        <w:t>is</w:t>
+      </w:r>
+      <w:proofErr w:type="spellEnd"/>
       <w:r>
         <w:rPr>
           <w:rFonts w:ascii="Consolas" w:hAnsi="Consolas"/>
           <w:sz w:val="20"/>
         </w:rPr>
+        <w:t xml:space="preserve"> </w:t>
+      </w:r>
+      <w:proofErr w:type="spellStart"/>
+      <w:r>
+        <w:rPr>
+          <w:rFonts w:ascii="Consolas" w:hAnsi="Consolas"/>
+          <w:sz w:val="20"/>
+        </w:rPr>
+        <w:t>None</w:t>
+      </w:r>
+      <w:proofErr w:type="spellEnd"/>
+      <w:r>
+        <w:rPr>
+          <w:rFonts w:ascii="Consolas" w:hAnsi="Consolas"/>
+          <w:sz w:val="20"/>
+        </w:rPr>
+        <w:t xml:space="preserve"> </w:t>
+      </w:r>
+      <w:proofErr w:type="spellStart"/>
+      <w:r>
+        <w:rPr>
+          <w:rFonts w:ascii="Consolas" w:hAnsi="Consolas"/>
+          <w:sz w:val="20"/>
+        </w:rPr>
+        <w:t>or</w:t>
+      </w:r>
+      <w:proofErr w:type="spellEnd"/>
+      <w:r>
+        <w:rPr>
+          <w:rFonts w:ascii="Consolas" w:hAnsi="Consolas"/>
+          <w:sz w:val="20"/>
+        </w:rPr>
+        <w:t xml:space="preserve"> </w:t>
+      </w:r>
+      <w:proofErr w:type="spellStart"/>
+      <w:r>
+        <w:rPr>
+          <w:rFonts w:ascii="Consolas" w:hAnsi="Consolas"/>
+          <w:sz w:val="20"/>
+        </w:rPr>
+        <w:t>maximo</w:t>
+      </w:r>
+      <w:proofErr w:type="spellEnd"/>
+      <w:r>
+        <w:rPr>
+          <w:rFonts w:ascii="Consolas" w:hAnsi="Consolas"/>
+          <w:sz w:val="20"/>
+        </w:rPr>
+        <w:t xml:space="preserve"> </w:t>
+      </w:r>
+      <w:proofErr w:type="spellStart"/>
+      <w:r>
+        <w:rPr>
+          <w:rFonts w:ascii="Consolas" w:hAnsi="Consolas"/>
+          <w:sz w:val="20"/>
+        </w:rPr>
+        <w:t>is</w:t>
+      </w:r>
+      <w:proofErr w:type="spellEnd"/>
+      <w:r>
+        <w:rPr>
+          <w:rFonts w:ascii="Consolas" w:hAnsi="Consolas"/>
+          <w:sz w:val="20"/>
+        </w:rPr>
+        <w:t xml:space="preserve"> </w:t>
+      </w:r>
+      <w:proofErr w:type="spellStart"/>
+      <w:r>
+        <w:rPr>
+          <w:rFonts w:ascii="Consolas" w:hAnsi="Consolas"/>
+          <w:sz w:val="20"/>
+        </w:rPr>
+        <w:t>None</w:t>
+      </w:r>
+      <w:proofErr w:type="spellEnd"/>
+      <w:r>
+        <w:rPr>
+          <w:rFonts w:ascii="Consolas" w:hAnsi="Consolas"/>
+          <w:sz w:val="20"/>
+        </w:rPr>
+        <w:t>:</w:t>
+      </w:r>
+      <w:r>
+        <w:rPr>
+          <w:rFonts w:ascii="Consolas" w:hAnsi="Consolas"/>
+          <w:sz w:val="20"/>
+        </w:rPr>
         <w:br/>
-        <w:t xml:space="preserve">    return ESTADO_DENTRO</w:t>
+        <w:t xml:space="preserve">        </w:t>
+      </w:r>
+      <w:proofErr w:type="spellStart"/>
+      <w:r>
+        <w:rPr>
+          <w:rFonts w:ascii="Consolas" w:hAnsi="Consolas"/>
+          <w:sz w:val="20"/>
+        </w:rPr>
+        <w:t>return</w:t>
+      </w:r>
+      <w:proofErr w:type="spellEnd"/>
+      <w:r>
+        <w:rPr>
+          <w:rFonts w:ascii="Consolas" w:hAnsi="Consolas"/>
+          <w:sz w:val="20"/>
+        </w:rPr>
+        <w:t xml:space="preserve"> ESTADO_SIN_RANGO</w:t>
+      </w:r>
+      <w:r>
+        <w:rPr>
+          <w:rFonts w:ascii="Consolas" w:hAnsi="Consolas"/>
+          <w:sz w:val="20"/>
+        </w:rPr>
+        <w:br/>
+        <w:t xml:space="preserve">    </w:t>
+      </w:r>
+      <w:proofErr w:type="spellStart"/>
+      <w:r>
+        <w:rPr>
+          <w:rFonts w:ascii="Consolas" w:hAnsi="Consolas"/>
+          <w:sz w:val="20"/>
+        </w:rPr>
+        <w:t>if</w:t>
+      </w:r>
+      <w:proofErr w:type="spellEnd"/>
+      <w:r>
+        <w:rPr>
+          <w:rFonts w:ascii="Consolas" w:hAnsi="Consolas"/>
+          <w:sz w:val="20"/>
+        </w:rPr>
+        <w:t xml:space="preserve"> valor &lt; </w:t>
+      </w:r>
+      <w:proofErr w:type="spellStart"/>
+      <w:r>
+        <w:rPr>
+          <w:rFonts w:ascii="Consolas" w:hAnsi="Consolas"/>
+          <w:sz w:val="20"/>
+        </w:rPr>
+        <w:t>minimo</w:t>
+      </w:r>
+      <w:proofErr w:type="spellEnd"/>
+      <w:r>
+        <w:rPr>
+          <w:rFonts w:ascii="Consolas" w:hAnsi="Consolas"/>
+          <w:sz w:val="20"/>
+        </w:rPr>
+        <w:t>:</w:t>
+      </w:r>
+      <w:r>
+        <w:rPr>
+          <w:rFonts w:ascii="Consolas" w:hAnsi="Consolas"/>
+          <w:sz w:val="20"/>
+        </w:rPr>
+        <w:br/>
+        <w:t xml:space="preserve">        </w:t>
+      </w:r>
+      <w:proofErr w:type="spellStart"/>
+      <w:r>
+        <w:rPr>
+          <w:rFonts w:ascii="Consolas" w:hAnsi="Consolas"/>
+          <w:sz w:val="20"/>
+        </w:rPr>
+        <w:t>return</w:t>
+      </w:r>
+      <w:proofErr w:type="spellEnd"/>
+      <w:r>
+        <w:rPr>
+          <w:rFonts w:ascii="Consolas" w:hAnsi="Consolas"/>
+          <w:sz w:val="20"/>
+        </w:rPr>
+        <w:t xml:space="preserve"> ESTADO_BAJO</w:t>
+      </w:r>
+      <w:r>
+        <w:rPr>
+          <w:rFonts w:ascii="Consolas" w:hAnsi="Consolas"/>
+          <w:sz w:val="20"/>
+        </w:rPr>
+        <w:br/>
+        <w:t xml:space="preserve">    </w:t>
+      </w:r>
+      <w:proofErr w:type="spellStart"/>
+      <w:r>
+        <w:rPr>
+          <w:rFonts w:ascii="Consolas" w:hAnsi="Consolas"/>
+          <w:sz w:val="20"/>
+        </w:rPr>
+        <w:t>if</w:t>
+      </w:r>
+      <w:proofErr w:type="spellEnd"/>
+      <w:r>
+        <w:rPr>
+          <w:rFonts w:ascii="Consolas" w:hAnsi="Consolas"/>
+          <w:sz w:val="20"/>
+        </w:rPr>
+        <w:t xml:space="preserve"> valor &gt; </w:t>
+      </w:r>
+      <w:proofErr w:type="spellStart"/>
+      <w:r>
+        <w:rPr>
+          <w:rFonts w:ascii="Consolas" w:hAnsi="Consolas"/>
+          <w:sz w:val="20"/>
+        </w:rPr>
+        <w:t>maximo</w:t>
+      </w:r>
+      <w:proofErr w:type="spellEnd"/>
+      <w:r>
+        <w:rPr>
+          <w:rFonts w:ascii="Consolas" w:hAnsi="Consolas"/>
+          <w:sz w:val="20"/>
+        </w:rPr>
+        <w:t>:</w:t>
+      </w:r>
+      <w:r>
+        <w:rPr>
+          <w:rFonts w:ascii="Consolas" w:hAnsi="Consolas"/>
+          <w:sz w:val="20"/>
+        </w:rPr>
+        <w:br/>
+        <w:t xml:space="preserve">        </w:t>
+      </w:r>
+      <w:proofErr w:type="spellStart"/>
+      <w:r>
+        <w:rPr>
+          <w:rFonts w:ascii="Consolas" w:hAnsi="Consolas"/>
+          <w:sz w:val="20"/>
+        </w:rPr>
+        <w:t>return</w:t>
+      </w:r>
+      <w:proofErr w:type="spellEnd"/>
+      <w:r>
+        <w:rPr>
+          <w:rFonts w:ascii="Consolas" w:hAnsi="Consolas"/>
+          <w:sz w:val="20"/>
+        </w:rPr>
+        <w:t xml:space="preserve"> ESTADO_ALTO</w:t>
+      </w:r>
+      <w:r>
+        <w:rPr>
+          <w:rFonts w:ascii="Consolas" w:hAnsi="Consolas"/>
+          <w:sz w:val="20"/>
+        </w:rPr>
+        <w:br/>
+        <w:t xml:space="preserve">    </w:t>
+      </w:r>
+      <w:proofErr w:type="spellStart"/>
+      <w:r>
+        <w:rPr>
+          <w:rFonts w:ascii="Consolas" w:hAnsi="Consolas"/>
+          <w:sz w:val="20"/>
+        </w:rPr>
+        <w:t>return</w:t>
+      </w:r>
+      <w:proofErr w:type="spellEnd"/>
+      <w:r>
+        <w:rPr>
+          <w:rFonts w:ascii="Consolas" w:hAnsi="Consolas"/>
+          <w:sz w:val="20"/>
+        </w:rPr>
+        <w:t xml:space="preserve"> ESTADO_DENTRO</w:t>
       </w:r>
     </w:p>
     <w:p>
@@ -20076,7 +21528,23 @@
         <w:t xml:space="preserve">Figura 7. </w:t>
       </w:r>
       <w:r>
-        <w:t>Calibración de fábrica del convertidor analógico en el firmware del módulo de adquisición, que sustituye la estimación por regla de tres. (Fuente: archivo main/main.c.)</w:t>
+        <w:t xml:space="preserve">Calibración de fábrica del convertidor analógico en el firmware del módulo de adquisición, que sustituye la estimación por regla de tres. (Fuente: archivo </w:t>
+      </w:r>
+      <w:proofErr w:type="spellStart"/>
+      <w:r>
+        <w:t>main</w:t>
+      </w:r>
+      <w:proofErr w:type="spellEnd"/>
+      <w:r>
+        <w:t>/</w:t>
+      </w:r>
+      <w:proofErr w:type="spellStart"/>
+      <w:r>
+        <w:t>main.c</w:t>
+      </w:r>
+      <w:proofErr w:type="spellEnd"/>
+      <w:r>
+        <w:t>.)</w:t>
       </w:r>
     </w:p>
     <w:p>
@@ -20093,13 +21561,29 @@
           <w:sz w:val="20"/>
         </w:rPr>
         <w:br/>
-        <w:t xml:space="preserve"> * RECTA, que se apoya en los valores grabados en el eFuse de fábrica. El de</w:t>
-      </w:r>
+        <w:t xml:space="preserve"> * RECTA, que se apoya en los valores grabados en el </w:t>
+      </w:r>
+      <w:proofErr w:type="spellStart"/>
       <w:r>
         <w:rPr>
           <w:rFonts w:ascii="Consolas" w:hAnsi="Consolas"/>
           <w:sz w:val="20"/>
         </w:rPr>
+        <w:t>eFuse</w:t>
+      </w:r>
+      <w:proofErr w:type="spellEnd"/>
+      <w:r>
+        <w:rPr>
+          <w:rFonts w:ascii="Consolas" w:hAnsi="Consolas"/>
+          <w:sz w:val="20"/>
+        </w:rPr>
+        <w:t xml:space="preserve"> de fábrica. El de</w:t>
+      </w:r>
+      <w:r>
+        <w:rPr>
+          <w:rFonts w:ascii="Consolas" w:hAnsi="Consolas"/>
+          <w:sz w:val="20"/>
+        </w:rPr>
         <w:br/>
         <w:t xml:space="preserve"> * AJUSTE DE CURVA existe únicamente en los ESP32-S2, S3 y C3. */</w:t>
       </w:r>
@@ -20109,39 +21593,38 @@
           <w:sz w:val="20"/>
         </w:rPr>
         <w:br/>
-        <w:t>adc_cali_line_fitting_config_t configuracion = {</w:t>
-      </w:r>
+      </w:r>
+      <w:proofErr w:type="spellStart"/>
       <w:r>
         <w:rPr>
           <w:rFonts w:ascii="Consolas" w:hAnsi="Consolas"/>
           <w:sz w:val="20"/>
         </w:rPr>
-        <w:br/>
-        <w:t xml:space="preserve">    .unit_id      = ADC_UNIT_1,</w:t>
-      </w:r>
+        <w:t>adc_cali_line_fitting_config_t</w:t>
+      </w:r>
+      <w:proofErr w:type="spellEnd"/>
       <w:r>
         <w:rPr>
           <w:rFonts w:ascii="Consolas" w:hAnsi="Consolas"/>
           <w:sz w:val="20"/>
         </w:rPr>
-        <w:br/>
-        <w:t xml:space="preserve">    .atten        = ADC_ATTEN_DB_12,</w:t>
-      </w:r>
+        <w:t xml:space="preserve"> </w:t>
+      </w:r>
+      <w:proofErr w:type="spellStart"/>
       <w:r>
         <w:rPr>
           <w:rFonts w:ascii="Consolas" w:hAnsi="Consolas"/>
           <w:sz w:val="20"/>
         </w:rPr>
-        <w:br/>
-        <w:t xml:space="preserve">    .bitwidth     = ADC_BITWIDTH_DEFAULT,</w:t>
-      </w:r>
+        <w:t>configuracion</w:t>
+      </w:r>
+      <w:proofErr w:type="spellEnd"/>
       <w:r>
         <w:rPr>
           <w:rFonts w:ascii="Consolas" w:hAnsi="Consolas"/>
           <w:sz w:val="20"/>
         </w:rPr>
-        <w:br/>
-        <w:t xml:space="preserve">    .default_vref = TENSION_REFERENCIA_MV,   /* campo exclusivo del ESP32 */</w:t>
+        <w:t xml:space="preserve"> = {</w:t>
       </w:r>
       <w:r>
         <w:rPr>
@@ -20149,21 +21632,164 @@
           <w:sz w:val="20"/>
         </w:rPr>
         <w:br/>
-        <w:t>};</w:t>
-      </w:r>
+        <w:t xml:space="preserve">  </w:t>
+      </w:r>
+      <w:proofErr w:type="gramStart"/>
       <w:r>
         <w:rPr>
           <w:rFonts w:ascii="Consolas" w:hAnsi="Consolas"/>
           <w:sz w:val="20"/>
         </w:rPr>
-        <w:br/>
-        <w:t>adc_cali_create_scheme_line_fitting(&amp;configuracion, &amp;manejador);</w:t>
-      </w:r>
+        <w:t xml:space="preserve">  .</w:t>
+      </w:r>
+      <w:proofErr w:type="spellStart"/>
       <w:r>
         <w:rPr>
           <w:rFonts w:ascii="Consolas" w:hAnsi="Consolas"/>
           <w:sz w:val="20"/>
         </w:rPr>
+        <w:t>unit</w:t>
+      </w:r>
+      <w:proofErr w:type="gramEnd"/>
+      <w:r>
+        <w:rPr>
+          <w:rFonts w:ascii="Consolas" w:hAnsi="Consolas"/>
+          <w:sz w:val="20"/>
+        </w:rPr>
+        <w:t>_id</w:t>
+      </w:r>
+      <w:proofErr w:type="spellEnd"/>
+      <w:r>
+        <w:rPr>
+          <w:rFonts w:ascii="Consolas" w:hAnsi="Consolas"/>
+          <w:sz w:val="20"/>
+        </w:rPr>
+        <w:t xml:space="preserve">      = ADC_UNIT_1,</w:t>
+      </w:r>
+      <w:r>
+        <w:rPr>
+          <w:rFonts w:ascii="Consolas" w:hAnsi="Consolas"/>
+          <w:sz w:val="20"/>
+        </w:rPr>
+        <w:br/>
+        <w:t xml:space="preserve">    .</w:t>
+      </w:r>
+      <w:proofErr w:type="spellStart"/>
+      <w:r>
+        <w:rPr>
+          <w:rFonts w:ascii="Consolas" w:hAnsi="Consolas"/>
+          <w:sz w:val="20"/>
+        </w:rPr>
+        <w:t>atten</w:t>
+      </w:r>
+      <w:proofErr w:type="spellEnd"/>
+      <w:r>
+        <w:rPr>
+          <w:rFonts w:ascii="Consolas" w:hAnsi="Consolas"/>
+          <w:sz w:val="20"/>
+        </w:rPr>
+        <w:t xml:space="preserve">        = ADC_ATTEN_DB_12,</w:t>
+      </w:r>
+      <w:r>
+        <w:rPr>
+          <w:rFonts w:ascii="Consolas" w:hAnsi="Consolas"/>
+          <w:sz w:val="20"/>
+        </w:rPr>
+        <w:br/>
+        <w:t xml:space="preserve">    .</w:t>
+      </w:r>
+      <w:proofErr w:type="spellStart"/>
+      <w:r>
+        <w:rPr>
+          <w:rFonts w:ascii="Consolas" w:hAnsi="Consolas"/>
+          <w:sz w:val="20"/>
+        </w:rPr>
+        <w:t>bitwidth</w:t>
+      </w:r>
+      <w:proofErr w:type="spellEnd"/>
+      <w:r>
+        <w:rPr>
+          <w:rFonts w:ascii="Consolas" w:hAnsi="Consolas"/>
+          <w:sz w:val="20"/>
+        </w:rPr>
+        <w:t xml:space="preserve">     = ADC_BITWIDTH_DEFAULT,</w:t>
+      </w:r>
+      <w:r>
+        <w:rPr>
+          <w:rFonts w:ascii="Consolas" w:hAnsi="Consolas"/>
+          <w:sz w:val="20"/>
+        </w:rPr>
+        <w:br/>
+        <w:t xml:space="preserve">    .</w:t>
+      </w:r>
+      <w:proofErr w:type="spellStart"/>
+      <w:r>
+        <w:rPr>
+          <w:rFonts w:ascii="Consolas" w:hAnsi="Consolas"/>
+          <w:sz w:val="20"/>
+        </w:rPr>
+        <w:t>default_vref</w:t>
+      </w:r>
+      <w:proofErr w:type="spellEnd"/>
+      <w:r>
+        <w:rPr>
+          <w:rFonts w:ascii="Consolas" w:hAnsi="Consolas"/>
+          <w:sz w:val="20"/>
+        </w:rPr>
+        <w:t xml:space="preserve"> = TENSION_REFERENCIA_MV,   /* campo exclusivo del ESP32 */</w:t>
+      </w:r>
+      <w:r>
+        <w:rPr>
+          <w:rFonts w:ascii="Consolas" w:hAnsi="Consolas"/>
+          <w:sz w:val="20"/>
+        </w:rPr>
+        <w:br/>
+        <w:t>};</w:t>
+      </w:r>
+      <w:r>
+        <w:rPr>
+          <w:rFonts w:ascii="Consolas" w:hAnsi="Consolas"/>
+          <w:sz w:val="20"/>
+        </w:rPr>
+        <w:br/>
+      </w:r>
+      <w:proofErr w:type="spellStart"/>
+      <w:r>
+        <w:rPr>
+          <w:rFonts w:ascii="Consolas" w:hAnsi="Consolas"/>
+          <w:sz w:val="20"/>
+        </w:rPr>
+        <w:t>adc_cali_create_scheme_line_fitting</w:t>
+      </w:r>
+      <w:proofErr w:type="spellEnd"/>
+      <w:r>
+        <w:rPr>
+          <w:rFonts w:ascii="Consolas" w:hAnsi="Consolas"/>
+          <w:sz w:val="20"/>
+        </w:rPr>
+        <w:t>(&amp;</w:t>
+      </w:r>
+      <w:proofErr w:type="spellStart"/>
+      <w:r>
+        <w:rPr>
+          <w:rFonts w:ascii="Consolas" w:hAnsi="Consolas"/>
+          <w:sz w:val="20"/>
+        </w:rPr>
+        <w:t>configuracion</w:t>
+      </w:r>
+      <w:proofErr w:type="spellEnd"/>
+      <w:r>
+        <w:rPr>
+          <w:rFonts w:ascii="Consolas" w:hAnsi="Consolas"/>
+          <w:sz w:val="20"/>
+        </w:rPr>
+        <w:t>, &amp;manejador);</w:t>
+      </w:r>
+      <w:r>
+        <w:rPr>
+          <w:rFonts w:ascii="Consolas" w:hAnsi="Consolas"/>
+          <w:sz w:val="20"/>
+        </w:rPr>
         <w:br/>
         <w:t>/* La primera conversión de un canal recién inicializado no es confiable: el</w:t>
       </w:r>
@@ -20173,13 +21799,29 @@
           <w:sz w:val="20"/>
         </w:rPr>
         <w:br/>
-        <w:t xml:space="preserve"> * convertidor necesita asentarse. Sin descartarla, informa 142 mV con</w:t>
-      </w:r>
+        <w:t xml:space="preserve"> * convertidor necesita asentarse. Sin descartarla, informa 142 </w:t>
+      </w:r>
+      <w:proofErr w:type="spellStart"/>
       <w:r>
         <w:rPr>
           <w:rFonts w:ascii="Consolas" w:hAnsi="Consolas"/>
           <w:sz w:val="20"/>
         </w:rPr>
+        <w:t>mV</w:t>
+      </w:r>
+      <w:proofErr w:type="spellEnd"/>
+      <w:r>
+        <w:rPr>
+          <w:rFonts w:ascii="Consolas" w:hAnsi="Consolas"/>
+          <w:sz w:val="20"/>
+        </w:rPr>
+        <w:t xml:space="preserve"> con</w:t>
+      </w:r>
+      <w:r>
+        <w:rPr>
+          <w:rFonts w:ascii="Consolas" w:hAnsi="Consolas"/>
+          <w:sz w:val="20"/>
+        </w:rPr>
         <w:br/>
         <w:t xml:space="preserve"> * dispersión cero, que parece una señal buena y no lo es. */</w:t>
       </w:r>
@@ -20189,7 +21831,38 @@
           <w:sz w:val="20"/>
         </w:rPr>
         <w:br/>
-        <w:t>vTaskDelay(pdMS_TO_TICKS(ASENTAMIENTO_ADC_MS));</w:t>
+      </w:r>
+      <w:proofErr w:type="spellStart"/>
+      <w:r>
+        <w:rPr>
+          <w:rFonts w:ascii="Consolas" w:hAnsi="Consolas"/>
+          <w:sz w:val="20"/>
+        </w:rPr>
+        <w:t>vTaskDelay</w:t>
+      </w:r>
+      <w:proofErr w:type="spellEnd"/>
+      <w:r>
+        <w:rPr>
+          <w:rFonts w:ascii="Consolas" w:hAnsi="Consolas"/>
+          <w:sz w:val="20"/>
+        </w:rPr>
+        <w:t>(</w:t>
+      </w:r>
+      <w:proofErr w:type="spellStart"/>
+      <w:r>
+        <w:rPr>
+          <w:rFonts w:ascii="Consolas" w:hAnsi="Consolas"/>
+          <w:sz w:val="20"/>
+        </w:rPr>
+        <w:t>pdMS_TO_TICKS</w:t>
+      </w:r>
+      <w:proofErr w:type="spellEnd"/>
+      <w:r>
+        <w:rPr>
+          <w:rFonts w:ascii="Consolas" w:hAnsi="Consolas"/>
+          <w:sz w:val="20"/>
+        </w:rPr>
+        <w:t>(ASENTAMIENTO_ADC_MS));</w:t>
       </w:r>
     </w:p>
     <w:p>
@@ -20222,7 +21895,7 @@
         <w:jc w:val="both"/>
       </w:pPr>
       <w:r>
-        <w:t>La verificación se sostiene en doscientas dos pruebas automatizadas —ciento seis del servicio y noventa y seis de la aplicación—, que se ejecutan sin credenciales ni conexión, y en los ensayos de campo del módulo de adquisición consignados en el apartado 2.8, cuyos registros se conservan en el repositorio.</w:t>
+        <w:t>La verificación se sostiene en doscientas dos pruebas automatizadas ciento seis del servicio y noventa y seis de la aplicación, que se ejecutan sin credenciales ni conexión, y en los ensayos de campo del módulo de adquisición consignados en el apartado 2.8, cuyos registros se conservan en el repositorio.</w:t>
       </w:r>
     </w:p>
     <w:p>
@@ -20274,7 +21947,15 @@
         <w:t>Autenticación y gestión de la sesión.</w:t>
       </w:r>
       <w:r>
-        <w:t xml:space="preserve"> El acceso se realiza mediante Firebase Authentication con correo y contraseña. El proveedor verifica las credenciales y emite un token de identidad que la aplicación adjunta a cada petición; el servicio valida ese token antes de procesarla. La aplicación no almacena contraseñas —el proveedor las conserva aplicando una función de derivación de clave— y el cierre de sesión invalida el token en el cliente. En concreto: el token </w:t>
+        <w:t xml:space="preserve"> El acceso se realiza mediante Firebase </w:t>
+      </w:r>
+      <w:proofErr w:type="spellStart"/>
+      <w:r>
+        <w:t>Authentication</w:t>
+      </w:r>
+      <w:proofErr w:type="spellEnd"/>
+      <w:r>
+        <w:t xml:space="preserve"> con correo y contraseña. El proveedor verifica las credenciales y emite un token de identidad que la aplicación adjunta a cada petición; el servicio valida ese token antes de procesarla. La aplicación no almacena contraseñas el proveedor las conserva aplicando una función de derivación de clave y el cierre de sesión invalida el token en el cliente. En concreto: el token </w:t>
       </w:r>
       <w:r>
         <w:rPr>
@@ -20285,18 +21966,28 @@
       <w:r>
         <w:t xml:space="preserve">; la función de derivación de clave que aplica el proveedor es </w:t>
       </w:r>
+      <w:proofErr w:type="spellStart"/>
       <w:r>
         <w:rPr>
           <w:b/>
         </w:rPr>
         <w:t>scrypt</w:t>
       </w:r>
-      <w:r>
-        <w:t xml:space="preserve"> —de la misma familia que bcrypt y argon2, y el algoritmo que Firebase declara usar para conservar las contraseñas de sus proyectos—, con sal por cuenta, de modo que las contraseñas no son recuperables ni siquiera </w:t>
+      <w:proofErr w:type="spellEnd"/>
+      <w:r>
+        <w:t xml:space="preserve"> de la misma familia que </w:t>
+      </w:r>
+      <w:proofErr w:type="spellStart"/>
+      <w:r>
+        <w:t>bcrypt</w:t>
+      </w:r>
+      <w:proofErr w:type="spellEnd"/>
+      <w:r>
+        <w:t xml:space="preserve"> y argon2, y el algoritmo que Firebase declara usar para conservar las contraseñas de sus proyectos, con sal por cuenta, de modo que las contraseñas no son recuperables ni siquiera para el </w:t>
       </w:r>
       <w:r>
         <w:lastRenderedPageBreak/>
-        <w:t xml:space="preserve">para el sistema; y cuando el servicio responde </w:t>
+        <w:t xml:space="preserve">sistema; y cuando el servicio responde </w:t>
       </w:r>
       <w:r>
         <w:rPr>
@@ -20305,7 +21996,7 @@
         <w:t>401</w:t>
       </w:r>
       <w:r>
-        <w:t xml:space="preserve"> —token vencido, revocado o inválido— la aplicación cierra la sesión y </w:t>
+        <w:t xml:space="preserve"> token vencido, revocado o inválido la aplicación cierra la sesión y </w:t>
       </w:r>
       <w:r>
         <w:rPr>
@@ -20340,7 +22031,7 @@
         <w:t>nivel de solo consulta</w:t>
       </w:r>
       <w:r>
-        <w:t xml:space="preserve"> —previsto como extensión y ya cubierto por pruebas— que permite habilitar cuentas de visitante sin modificar la lógica de autorización.</w:t>
+        <w:t xml:space="preserve"> previsto como extensión y ya cubierto por pruebas que permite habilitar cuentas de visitante sin modificar la lógica de autorización.</w:t>
       </w:r>
     </w:p>
     <w:p>
@@ -20357,7 +22048,15 @@
         <w:t>Autenticación del módulo de adquisición.</w:t>
       </w:r>
       <w:r>
-        <w:t xml:space="preserve"> El dispositivo no utiliza credenciales de usuario ni de la cuenta de servicio: se autentica con una clave propia, enviada en la cabecera X-Device-Key, que reside en las variables de entorno del servidor y puede rotarse sin afectar a los usuarios del sistema.</w:t>
+        <w:t xml:space="preserve"> El dispositivo no utiliza credenciales de usuario ni de la cuenta de servicio: se autentica con una clave propia, enviada en la cabecera X-</w:t>
+      </w:r>
+      <w:proofErr w:type="spellStart"/>
+      <w:r>
+        <w:t>Device</w:t>
+      </w:r>
+      <w:proofErr w:type="spellEnd"/>
+      <w:r>
+        <w:t>-Key, que reside en las variables de entorno del servidor y puede rotarse sin afectar a los usuarios del sistema.</w:t>
       </w:r>
     </w:p>
     <w:p>
@@ -20374,7 +22073,7 @@
         <w:t>Validación de datos de entrada.</w:t>
       </w:r>
       <w:r>
-        <w:t xml:space="preserve"> La validación se aplica en dos niveles. En el cliente, la interfaz impide el envío de campos incompletos o de tipo incorrecto. En el servidor, el servicio valida cada campo recibido —tipo, rango admitido, unidad y referencia al módulo y a la variable— y rechaza la petición con el código 422 indicando el campo que no cumple la condición. Esta doble barrera protege al sistema frente al envío de valores no esperados y frente a la manipulación directa de las peticiones, que es la vía de ataque más probable en una arquitectura cliente-servidor.</w:t>
+        <w:t xml:space="preserve"> La validación se aplica en dos niveles. En el cliente, la interfaz impide el envío de campos incompletos o de tipo incorrecto. En el servidor, el servicio valida cada campo recibido tipo, rango admitido, unidad y referencia al módulo y a la variable y rechaza la petición con el código 422 indicando el campo que no cumple la condición. Esta doble barrera protege al sistema frente al envío de valores no esperados y frente a la manipulación directa de las peticiones, que es la vía de ataque más probable en una arquitectura cliente-servidor.</w:t>
       </w:r>
     </w:p>
     <w:p>
@@ -20391,11 +22090,13 @@
         <w:t>Cifrado de credenciales y de las comunicaciones.</w:t>
       </w:r>
       <w:r>
-        <w:t xml:space="preserve"> Las contraseñas nunca son almacenadas por la aplicación y viajan únicamente hacia el proveedor de </w:t>
-      </w:r>
-      <w:r>
-        <w:lastRenderedPageBreak/>
-        <w:t>identidad sobre HTTPS; el resto de las comunicaciones —aplicación, módulo de adquisición, servicio y base de datos— se realizan también sobre HTTPS.</w:t>
+        <w:t xml:space="preserve"> Las contraseñas nunca son almacenadas por la aplicación y viajan únicamente hacia el proveedor de identidad sobre HTTPS; el resto de las comunicaciones aplicación, módulo de adquisición, servicio y base de datos</w:t>
+      </w:r>
+      <w:r>
+        <w:t xml:space="preserve"> </w:t>
+      </w:r>
+      <w:r>
+        <w:t>se realizan también sobre HTTPS.</w:t>
       </w:r>
     </w:p>
     <w:p>
@@ -20403,6 +22104,7 @@
         <w:jc w:val="both"/>
       </w:pPr>
       <w:r>
+        <w:lastRenderedPageBreak/>
         <w:t xml:space="preserve">•  </w:t>
       </w:r>
       <w:r>
@@ -20412,7 +22114,32 @@
         <w:t>Gestión de variables sensibles.</w:t>
       </w:r>
       <w:r>
-        <w:t xml:space="preserve"> Las credenciales y claves se gestionan mediante variables de entorno y no figuran en el documento ni en el repositorio de código. El repositorio incluye el archivo .env.example, que documenta las variables requeridas con valores vacíos o de ejemplo, y su archivo .gitignore excluye las claves del cliente de Firebase, el archivo de la cuenta de servicio y los almacenes de claves de firma de Android. Antes de la entrega se revisó el </w:t>
+        <w:t xml:space="preserve"> Las credenciales y claves se gestionan mediante variables de entorno y no figuran en el documento ni en el repositorio de código. El repositorio incluye el </w:t>
+      </w:r>
+      <w:r>
+        <w:t xml:space="preserve">archivo. </w:t>
+      </w:r>
+      <w:proofErr w:type="spellStart"/>
+      <w:r>
+        <w:t>env</w:t>
+      </w:r>
+      <w:r>
+        <w:t>.example</w:t>
+      </w:r>
+      <w:proofErr w:type="spellEnd"/>
+      <w:r>
+        <w:t xml:space="preserve">, que documenta las variables requeridas con valores vacíos o de ejemplo, y su </w:t>
+      </w:r>
+      <w:r>
+        <w:t xml:space="preserve">archivo. </w:t>
+      </w:r>
+      <w:proofErr w:type="spellStart"/>
+      <w:r>
+        <w:t>gitignore</w:t>
+      </w:r>
+      <w:proofErr w:type="spellEnd"/>
+      <w:r>
+        <w:t xml:space="preserve"> excluye las claves del cliente de Firebase, el archivo de la cuenta de servicio y los almacenes de claves de firma de Android. Antes de la entrega se revisó el </w:t>
       </w:r>
       <w:r>
         <w:rPr>
@@ -20421,7 +22148,7 @@
         <w:t>historial completo</w:t>
       </w:r>
       <w:r>
-        <w:t xml:space="preserve"> de confirmaciones en busca de credenciales —claves privadas, contraseñas y claves de dispositivo—, con resultado negativo, y se reemplazó la clave del módulo de adquisición que había conservado el valor de ejemplo publicado en la plantilla del repositorio.</w:t>
+        <w:t xml:space="preserve"> de confirmaciones en busca de credenciales claves privadas, contraseñas y claves de dispositivo, con resultado negativo, y se reemplazó la clave del módulo de adquisición que había conservado el valor de ejemplo publicado en la plantilla del repositorio.</w:t>
       </w:r>
     </w:p>
     <w:p>
@@ -20447,7 +22174,7 @@
         <w:t>contra la base de datos real</w:t>
       </w:r>
       <w:r>
-        <w:t>, no solo por inspección: consultando la interfaz de programación de Cloud Firestore sin credenciales, las cinco colecciones del dominio responden con permiso denegado, mientras que la misma consulta con la cuenta de servicio responde con acceso permitido. La comprobación quedó implementada como programa reproducible —de modo que pueda repetirse tras cualquier cambio en las reglas— y su resultado se documenta en el anexo correspondiente. Prueba que el único camino hacia los datos es el servicio, que es donde se validan las entradas y se autoriza por rol.</w:t>
+        <w:t>, no solo por inspección: consultando la interfaz de programación de Cloud Firestore sin credenciales, las cinco colecciones del dominio responden con permiso denegado, mientras que la misma consulta con la cuenta de servicio responde con acceso permitido. La comprobación quedó implementada como programa reproducible de modo que pueda repetirse tras cualquier cambio en las reglas y su resultado se documenta en el anexo correspondiente. Prueba que el único camino hacia los datos es el servicio, que es donde se validan las entradas y se autoriza por rol.</w:t>
       </w:r>
     </w:p>
     <w:p>
@@ -20478,7 +22205,7 @@
         <w:t>El rechazo lo decide el servidor.</w:t>
       </w:r>
       <w:r>
-        <w:t xml:space="preserve"> Con las dos cuentas de prueba y sin ninguna modificación en la aplicación, la misma ruta —GET /api/v1/usuarios, que es de administración— respondió </w:t>
+        <w:t xml:space="preserve"> Con las dos cuentas de prueba y sin ninguna modificación en la aplicación, la misma ruta GET /api/v1/usuarios, que es de administración respondió </w:t>
       </w:r>
       <w:r>
         <w:rPr>
@@ -20505,11 +22232,31 @@
         <w:t>200</w:t>
       </w:r>
       <w:r>
-        <w:t xml:space="preserve"> con la del administrador, con el cuerpo de error {"codigo":"sin_permiso", …, "rol_actual":"operador"}. La medición quedó registrada en evidencia/cuentas-de-prueba-2026-09-29.txt. La interfaz, además, no ofrece esa opción al operador: la misma pantalla de Ajustes la muestra con la sesión del administrador (Figura 8) </w:t>
-      </w:r>
-      <w:r>
-        <w:lastRenderedPageBreak/>
-        <w:t>y no con la del operador, como se ve en las capturas C-19 y C-25 de la carpeta de evidencia.</w:t>
+        <w:t xml:space="preserve"> con la del administrador, con el cuerpo de error {"</w:t>
+      </w:r>
+      <w:proofErr w:type="spellStart"/>
+      <w:r>
+        <w:t>codigo</w:t>
+      </w:r>
+      <w:proofErr w:type="spellEnd"/>
+      <w:r>
+        <w:t>":"</w:t>
+      </w:r>
+      <w:proofErr w:type="spellStart"/>
+      <w:r>
+        <w:t>sin_permiso</w:t>
+      </w:r>
+      <w:proofErr w:type="spellEnd"/>
+      <w:r>
+        <w:t>", …, "</w:t>
+      </w:r>
+      <w:proofErr w:type="spellStart"/>
+      <w:r>
+        <w:t>rol_actual":"operador</w:t>
+      </w:r>
+      <w:proofErr w:type="spellEnd"/>
+      <w:r>
+        <w:t>"}. La medición quedó registrada en evidencia/cuentas-de-prueba-2026-09-29.txt. La interfaz, además, no ofrece esa opción al operador: la misma pantalla de Ajustes la muestra con la sesión del administrador (Figura 8) y no con la del operador, como se ve en las capturas C-19 y C-25 de la carpeta de evidencia.</w:t>
       </w:r>
     </w:p>
     <w:p>
@@ -20517,6 +22264,7 @@
         <w:jc w:val="both"/>
       </w:pPr>
       <w:r>
+        <w:lastRenderedPageBreak/>
         <w:t xml:space="preserve">•  </w:t>
       </w:r>
       <w:r>
@@ -20526,7 +22274,7 @@
         <w:t>Una escalada de privilegios, encontrada y cerrada.</w:t>
       </w:r>
       <w:r>
-        <w:t xml:space="preserve"> El alta de un perfil admitía el rol de administrador para un correo concreto: quien consiguiera registrarse con esa dirección obtenía las atribuciones de administración sin que nadie se las concediera. La excepción se retiró de los dos lugares donde estaba —la regla de seguridad de Cloud Firestore y el repositorio de la aplicación—, de modo que el alta solo admite el rol de operación y el rol de administrador se concede después, desde el panel o desde el servicio. El conjunto de reglas publicado se comparó con el del repositorio y coinciden; la comprobación es reproducible con verificar_reglas_firestore.py y su resultado está en evidencia/reglas-firestore-2026-09-29.txt.</w:t>
+        <w:t xml:space="preserve"> El alta de un perfil admitía el rol de administrador para un correo concreto: quien consiguiera registrarse con esa dirección obtenía las atribuciones de administración sin que nadie se las concediera. La excepción se retiró de los dos lugares donde estaba la regla de seguridad de Cloud Firestore y el repositorio de la aplicación, de modo que el alta solo admite el rol de operación y el rol de administrador se concede después, desde el panel o desde el servicio. El conjunto de reglas publicado se comparó con el del repositorio y coinciden; la comprobación es reproducible con verificar_reglas_firestore.py y su resultado está en evidencia/reglas-firestore-2026-09-29.txt.</w:t>
       </w:r>
     </w:p>
     <w:p>
@@ -20551,7 +22299,6 @@
         <w:rPr>
           <w:noProof/>
         </w:rPr>
-        <w:lastRenderedPageBreak/>
         <w:drawing>
           <wp:inline distT="0" distB="0" distL="0" distR="0" wp14:anchorId="0748A75E" wp14:editId="12B2556B">
             <wp:extent cx="4633017" cy="4092498"/>
@@ -20595,7 +22342,24 @@
           <w:i/>
           <w:sz w:val="20"/>
         </w:rPr>
-        <w:t>Figura 8. Ajustes con la sesión del administrador: la opción «Usuarios (admin)» aparece en la lista. Con la sesión del operador esa opción no existe, y el servicio responde 403 si se pide igual. Fuente: capturas de Proyecto SIGVACH/evidencia/capturas-2026-09-30/, tomadas sobre la dirección publicada el 2 de octubre de 2026.</w:t>
+        <w:lastRenderedPageBreak/>
+        <w:t>Figura 8. Ajustes con la sesión del administrador: la opción «Usuarios (</w:t>
+      </w:r>
+      <w:proofErr w:type="spellStart"/>
+      <w:r>
+        <w:rPr>
+          <w:i/>
+          <w:sz w:val="20"/>
+        </w:rPr>
+        <w:t>admin</w:t>
+      </w:r>
+      <w:proofErr w:type="spellEnd"/>
+      <w:r>
+        <w:rPr>
+          <w:i/>
+          <w:sz w:val="20"/>
+        </w:rPr>
+        <w:t>)» aparece en la lista. Con la sesión del operador esa opción no existe, y el servicio responde 403 si se pide igual. Fuente: capturas de Proyecto SIGVACH/evidencia/capturas-2026-09-30/, tomadas sobre la dirección publicada el 2 de octubre de 2026.</w:t>
       </w:r>
     </w:p>
     <w:p>
@@ -20625,7 +22389,21 @@
         <w:rPr>
           <w:bCs/>
         </w:rPr>
-        <w:t xml:space="preserve">C-nn </w:t>
+        <w:t>C-</w:t>
+      </w:r>
+      <w:proofErr w:type="spellStart"/>
+      <w:r>
+        <w:rPr>
+          <w:bCs/>
+        </w:rPr>
+        <w:t>nn</w:t>
+      </w:r>
+      <w:proofErr w:type="spellEnd"/>
+      <w:r>
+        <w:rPr>
+          <w:bCs/>
+        </w:rPr>
+        <w:t xml:space="preserve"> </w:t>
       </w:r>
       <w:r>
         <w:t>y corresponden a los archivos numerados de Proyecto SIGVACH/evidencia/capturas-2026-09-30/, tomados sobre la dirección publicada entre el 30 de septiembre y el 2 de octubre de 2026; el LEEME.md de esa carpeta indica la fecha, la cuenta y el contenido de cada una. Los informes de las herramientas se citan por su archivo en Proyecto SIGVACH/evidencia/.</w:t>
@@ -21518,7 +23296,7 @@
                 <w:sz w:val="18"/>
                 <w:szCs w:val="18"/>
               </w:rPr>
-              <w:t xml:space="preserve">Verificado el 02/10 sobre el sistema publicado: la pantalla de usuarios lista las cuentas con su rol y sus acciones de administración (C-30), y solo es alcanzable con el rol de administración —la opción está en Ajustes con esa sesión (C-29 y Figura 8) y no con la del operador (C-19 y C-25)—. El cambio de rol y su autorización están cubiertos por pruebas automatizadas del servicio. </w:t>
+              <w:t xml:space="preserve">Verificado el 02/10 sobre el sistema publicado: la pantalla de usuarios lista las cuentas con su rol y sus acciones de administración (C-30), y solo es alcanzable con el rol de administración la opción está en Ajustes con esa sesión (C-29 y Figura 8) y no con la del operador (C-19 y C-25). El cambio de rol y su autorización están cubiertos por pruebas automatizadas del servicio. </w:t>
             </w:r>
             <w:r>
               <w:rPr>
@@ -22005,7 +23783,7 @@
                 <w:sz w:val="18"/>
                 <w:szCs w:val="18"/>
               </w:rPr>
-              <w:t xml:space="preserve">Aprobado con pruebas automatizadas —respuesta 201, estado evaluado, origen automático y unidad heredada del catálogo— y con los ensayos de campo del módulo: publica las </w:t>
+              <w:t xml:space="preserve">Aprobado con pruebas automatizadas respuesta 201, estado evaluado, origen automático y unidad heredada del catálogo y con los ensayos de campo del módulo: publica las </w:t>
             </w:r>
             <w:r>
               <w:rPr>
@@ -24095,7 +25873,7 @@
                 <w:sz w:val="18"/>
                 <w:szCs w:val="18"/>
               </w:rPr>
-              <w:t xml:space="preserve">Aprobado: responde 401 sin devolver dato alguno, también con la cabecera mal formada o con un token no reconocido (pruebas automatizadas), y se midió contra el servicio publicado —GET /api/v1/usuarios responde </w:t>
+              <w:t xml:space="preserve">Aprobado: responde 401 sin devolver dato alguno, también con la cabecera mal formada o con un token no reconocido (pruebas automatizadas), y se midió contra el servicio publicado GET /api/v1/usuarios responde </w:t>
             </w:r>
             <w:r>
               <w:rPr>
@@ -24140,7 +25918,14 @@
                 <w:sz w:val="18"/>
                 <w:szCs w:val="18"/>
               </w:rPr>
-              <w:t xml:space="preserve"> con la del administrador, en cuentas-de-prueba-2026-09-29.txt—</w:t>
+              <w:t xml:space="preserve"> con la del administrador, en cuentas-de-prueba-2026-09-29.txt</w:t>
+            </w:r>
+            <w:r>
+              <w:rPr>
+                <w:sz w:val="18"/>
+                <w:szCs w:val="18"/>
+              </w:rPr>
+              <w:t>.</w:t>
             </w:r>
           </w:p>
         </w:tc>
@@ -24249,7 +26034,23 @@
                 <w:sz w:val="18"/>
                 <w:szCs w:val="18"/>
               </w:rPr>
-              <w:t>Petición al endpoint de salud tras quince minutos sin uso</w:t>
+              <w:t xml:space="preserve">Petición al </w:t>
+            </w:r>
+            <w:proofErr w:type="spellStart"/>
+            <w:r>
+              <w:rPr>
+                <w:sz w:val="18"/>
+                <w:szCs w:val="18"/>
+              </w:rPr>
+              <w:t>endpoint</w:t>
+            </w:r>
+            <w:proofErr w:type="spellEnd"/>
+            <w:r>
+              <w:rPr>
+                <w:sz w:val="18"/>
+                <w:szCs w:val="18"/>
+              </w:rPr>
+              <w:t xml:space="preserve"> de salud tras quince minutos sin uso</w:t>
             </w:r>
           </w:p>
         </w:tc>
@@ -24658,7 +26459,39 @@
                 <w:sz w:val="18"/>
                 <w:szCs w:val="18"/>
               </w:rPr>
-              <w:t xml:space="preserve"> (C-32, imagen de 720 px de ancho, unos 360 px lógicos), la misma pantalla con la ventana del navegador en </w:t>
+              <w:t xml:space="preserve"> (C-32, imagen de 720 </w:t>
+            </w:r>
+            <w:proofErr w:type="spellStart"/>
+            <w:r>
+              <w:rPr>
+                <w:sz w:val="18"/>
+                <w:szCs w:val="18"/>
+              </w:rPr>
+              <w:t>px</w:t>
+            </w:r>
+            <w:proofErr w:type="spellEnd"/>
+            <w:r>
+              <w:rPr>
+                <w:sz w:val="18"/>
+                <w:szCs w:val="18"/>
+              </w:rPr>
+              <w:t xml:space="preserve"> de ancho, unos 360 </w:t>
+            </w:r>
+            <w:proofErr w:type="spellStart"/>
+            <w:r>
+              <w:rPr>
+                <w:sz w:val="18"/>
+                <w:szCs w:val="18"/>
+              </w:rPr>
+              <w:t>px</w:t>
+            </w:r>
+            <w:proofErr w:type="spellEnd"/>
+            <w:r>
+              <w:rPr>
+                <w:sz w:val="18"/>
+                <w:szCs w:val="18"/>
+              </w:rPr>
+              <w:t xml:space="preserve"> lógicos), la misma pantalla con la ventana del navegador en </w:t>
             </w:r>
             <w:r>
               <w:rPr>
@@ -24666,29 +26499,49 @@
                 <w:sz w:val="18"/>
                 <w:szCs w:val="18"/>
               </w:rPr>
-              <w:t>768 px</w:t>
-            </w:r>
-            <w:r>
-              <w:rPr>
-                <w:sz w:val="18"/>
-                <w:szCs w:val="18"/>
-              </w:rPr>
-              <w:t xml:space="preserve"> (C-33) y en </w:t>
-            </w:r>
+              <w:t xml:space="preserve">768 </w:t>
+            </w:r>
+            <w:proofErr w:type="spellStart"/>
             <w:r>
               <w:rPr>
                 <w:b/>
                 <w:sz w:val="18"/>
                 <w:szCs w:val="18"/>
               </w:rPr>
-              <w:t>1920 px</w:t>
-            </w:r>
+              <w:t>px</w:t>
+            </w:r>
+            <w:proofErr w:type="spellEnd"/>
             <w:r>
               <w:rPr>
                 <w:sz w:val="18"/>
                 <w:szCs w:val="18"/>
               </w:rPr>
-              <w:t xml:space="preserve"> (C-34). En las tres el contenido se reorganiza —una sola columna cuando es angosta y una cuadrícula cuando es ancha— y </w:t>
+              <w:t xml:space="preserve"> (C-33) y en </w:t>
+            </w:r>
+            <w:r>
+              <w:rPr>
+                <w:b/>
+                <w:sz w:val="18"/>
+                <w:szCs w:val="18"/>
+              </w:rPr>
+              <w:t xml:space="preserve">1920 </w:t>
+            </w:r>
+            <w:proofErr w:type="spellStart"/>
+            <w:r>
+              <w:rPr>
+                <w:b/>
+                <w:sz w:val="18"/>
+                <w:szCs w:val="18"/>
+              </w:rPr>
+              <w:t>px</w:t>
+            </w:r>
+            <w:proofErr w:type="spellEnd"/>
+            <w:r>
+              <w:rPr>
+                <w:sz w:val="18"/>
+                <w:szCs w:val="18"/>
+              </w:rPr>
+              <w:t xml:space="preserve"> (C-34). En las tres el contenido se reorganiza una sola columna cuando es angosta y una cuadrícula cuando es ancha y </w:t>
             </w:r>
             <w:r>
               <w:rPr>
@@ -24883,7 +26736,7 @@
                 <w:sz w:val="18"/>
                 <w:szCs w:val="18"/>
               </w:rPr>
-              <w:t xml:space="preserve"> con el tamaño que usa el panel —percentil 95 de </w:t>
+              <w:t xml:space="preserve"> con el tamaño que usa el panel percentil 95 de </w:t>
             </w:r>
             <w:r>
               <w:rPr>
@@ -24898,7 +26751,7 @@
                 <w:sz w:val="18"/>
                 <w:szCs w:val="18"/>
               </w:rPr>
-              <w:t xml:space="preserve"> con cinco registros, 15 de 15 dentro del objetivo— y </w:t>
+              <w:t xml:space="preserve"> con cinco registros, 15 de 15 dentro del objetivo y </w:t>
             </w:r>
             <w:r>
               <w:rPr>
@@ -25424,7 +27277,7 @@
         <w:t>seis de forma parcial</w:t>
       </w:r>
       <w:r>
-        <w:t xml:space="preserve"> —el escenario declarado tiene una parte verificada y otra pendiente de prueba, que se indica en la propia fila—, </w:t>
+        <w:t xml:space="preserve"> el escenario declarado tiene una parte verificada y otra pendiente de prueba, que se indica en la propia fila, </w:t>
       </w:r>
       <w:r>
         <w:rPr>
@@ -25483,11 +27336,11 @@
         <w:t>ciento seis pruebas en nueve archivos</w:t>
       </w:r>
       <w:r>
-        <w:t xml:space="preserve">: autenticación y autorización por rol (14), contrato del recurso de lecturas (19), reglas de evaluación y resumen de series (11), </w:t>
+        <w:t xml:space="preserve">: autenticación y autorización por rol (14), contrato del recurso de lecturas (19), reglas de evaluación y resumen de series (11), validación de entradas (13), rol de solo consulta (12), cuentas y perfil de usuario </w:t>
       </w:r>
       <w:r>
         <w:lastRenderedPageBreak/>
-        <w:t xml:space="preserve">validación de entradas (13), rol de solo consulta (12), cuentas y perfil de usuario (26), nombre del perfil en las respuestas de módulos (4), orden de los módulos (2) y semilla del modo de demostración (5). La aplicación reúne </w:t>
+        <w:t xml:space="preserve">(26), nombre del perfil en las respuestas de módulos (4), orden de los módulos (2) y semilla del modo de demostración (5). La aplicación reúne </w:t>
       </w:r>
       <w:r>
         <w:rPr>
@@ -25496,7 +27349,31 @@
         <w:t>noventa y seis casos en ocho archivos</w:t>
       </w:r>
       <w:r>
-        <w:t xml:space="preserve">: cliente del servicio (19), repositorios y modelos del contrato (25), panel de visualización (16), lecturas (12), estados de las vistas (10), vocabulario de roles (10), encabezado del menú (3) y conversión del clima (1). Se ejecutan con python -m pytest desde el directorio backend y con flutter test, respectivamente, y sus reportes quedaron versionados en evidencia/pytest-2026-10-02.txt y evidencia/flutter-test-2026-10-02.txt. Ninguna requiere credenciales ni conexión: el servicio sustituye Cloud Firestore por un repositorio en memoria y el verificador de identidad por uno simulado, y la aplicación emplea un servicio simulado, de modo que </w:t>
+        <w:t xml:space="preserve">: cliente del servicio (19), repositorios y modelos del contrato (25), panel de visualización (16), lecturas (12), estados de las vistas (10), vocabulario de roles (10), encabezado del menú (3) y conversión del clima (1). Se ejecutan con </w:t>
+      </w:r>
+      <w:proofErr w:type="spellStart"/>
+      <w:r>
+        <w:t>python</w:t>
+      </w:r>
+      <w:proofErr w:type="spellEnd"/>
+      <w:r>
+        <w:t xml:space="preserve"> -m </w:t>
+      </w:r>
+      <w:proofErr w:type="spellStart"/>
+      <w:r>
+        <w:t>pytest</w:t>
+      </w:r>
+      <w:proofErr w:type="spellEnd"/>
+      <w:r>
+        <w:t xml:space="preserve"> desde el directorio backend y con </w:t>
+      </w:r>
+      <w:proofErr w:type="spellStart"/>
+      <w:r>
+        <w:t>flutter</w:t>
+      </w:r>
+      <w:proofErr w:type="spellEnd"/>
+      <w:r>
+        <w:t xml:space="preserve"> test, respectivamente, y sus reportes quedaron versionados en evidencia/pytest-2026-10-02.txt y evidencia/flutter-test-2026-10-02.txt. Ninguna requiere credenciales ni conexión: el servicio sustituye Cloud Firestore por un repositorio en memoria y el verificador de identidad por uno simulado, y la aplicación emplea un servicio simulado, de modo que </w:t>
       </w:r>
       <w:r>
         <w:rPr>
@@ -25537,7 +27414,13 @@
         <w:t>treinta y cuatro</w:t>
       </w:r>
       <w:r>
-        <w:t>, tomadas entre el 30 de septiembre y el 2 de octubre de 2026, y cada una conserva la barra de direcciones del navegador y el reloj del sistema, que son lo que las hace verificables. La carpeta Proyecto SIGVACH/evidencia/capturas-2026-09-30/ contiene las imágenes y su índice —con la fecha, la cuenta y el contenido de cada una, además de la correspondencia con los casos de esta tabla—, y en ella quedaron aparte las tomas descartadas y la constancia de que la pantalla de usuarios se anonimizó antes de incorporarla, para no exponer datos personales de terceros.</w:t>
+        <w:t>, tomadas entre el 30 de septiembre y el 2 de octubre de 2026, y cada una conserva la barra de direcciones del navegador y el reloj del sistema, que son lo que las hace verificables. La carpeta Proyecto SIGVACH/evidencia/capturas-2026-09-30/ contiene las imágenes y su índice</w:t>
+      </w:r>
+      <w:r>
+        <w:t xml:space="preserve"> </w:t>
+      </w:r>
+      <w:r>
+        <w:t>con la fecha, la cuenta y el contenido de cada una, además de la correspondencia con los casos de esta tabla, y en ella quedaron aparte las tomas descartadas y la constancia de que la pantalla de usuarios se anonimizó antes de incorporarla, para no exponer datos personales de terceros.</w:t>
       </w:r>
     </w:p>
     <w:p>
@@ -25591,7 +27474,7 @@
           <w:i/>
           <w:sz w:val="20"/>
         </w:rPr>
-        <w:t>Figura 9. La alerta del pH, ya atendida: la misma alerta que se veía activa con su lectura de origen aparece ahora en el historial con su marca de «Atendida». El recorrido completo —activa, acción y resultado— está en las capturas C-21, C-22 y C-23. Fuente: capturas de Proyecto SIGVACH/evidencia/capturas-2026-09-30/, tomadas sobre la dirección publicada el 2 de octubre de 2026.</w:t>
+        <w:t>Figura 9. La alerta del pH, ya atendida: la misma alerta que se veía activa con su lectura de origen aparece ahora en el historial con su marca de «Atendida». El recorrido completo activa, acción y resultado está en las capturas C-21, C-22 y C-23. Fuente: capturas de Proyecto SIGVACH/evidencia/capturas-2026-09-30/, tomadas sobre la dirección publicada el 2 de octubre de 2026.</w:t>
       </w:r>
     </w:p>
     <w:sectPr>

</xml_diff>